<commit_message>
cambios del README y docs
</commit_message>
<xml_diff>
--- a/docs/guia_materiales_taller2.docx
+++ b/docs/guia_materiales_taller2.docx
@@ -2159,10 +2159,10 @@
           <w:noProof/>
         </w:rPr>
         <w:drawing>
-          <wp:inline distT="0" distB="0" distL="0" distR="0" wp14:anchorId="5C7BE723" wp14:editId="4016A5F6">
-            <wp:extent cx="5731510" cy="849630"/>
-            <wp:effectExtent l="0" t="0" r="2540" b="7620"/>
-            <wp:docPr id="1743738951" name="Imagen 1"/>
+          <wp:inline distT="0" distB="0" distL="0" distR="0" wp14:anchorId="15FBB4D6" wp14:editId="7D27D3E6">
+            <wp:extent cx="5731510" cy="945515"/>
+            <wp:effectExtent l="0" t="0" r="2540" b="6985"/>
+            <wp:docPr id="548836266" name="Imagen 1"/>
             <wp:cNvGraphicFramePr>
               <a:graphicFrameLocks xmlns:a="http://schemas.openxmlformats.org/drawingml/2006/main" noChangeAspect="1"/>
             </wp:cNvGraphicFramePr>
@@ -2170,7 +2170,7 @@
               <a:graphicData uri="http://schemas.openxmlformats.org/drawingml/2006/picture">
                 <pic:pic xmlns:pic="http://schemas.openxmlformats.org/drawingml/2006/picture">
                   <pic:nvPicPr>
-                    <pic:cNvPr id="1743738951" name="Imagen 1743738951"/>
+                    <pic:cNvPr id="548836266" name="Imagen 548836266"/>
                     <pic:cNvPicPr/>
                   </pic:nvPicPr>
                   <pic:blipFill>
@@ -2188,7 +2188,7 @@
                   <pic:spPr>
                     <a:xfrm>
                       <a:off x="0" y="0"/>
-                      <a:ext cx="5731510" cy="849630"/>
+                      <a:ext cx="5731510" cy="945515"/>
                     </a:xfrm>
                     <a:prstGeom prst="rect">
                       <a:avLst/>
@@ -2237,6 +2237,7 @@
           <w:bCs/>
           <w:color w:val="000000"/>
         </w:rPr>
+        <w:lastRenderedPageBreak/>
         <w:t>Tabla 2</w:t>
       </w:r>
     </w:p>
@@ -2250,7 +2251,6 @@
           <w:iCs/>
           <w:color w:val="000000"/>
         </w:rPr>
-        <w:lastRenderedPageBreak/>
         <w:t>Hoja de condiciones “condiciones_practica_stroop.xlsx”</w:t>
       </w:r>
     </w:p>

</xml_diff>

<commit_message>
agregar figuras de secuencia y cruz de fijación al diagrama de flujo
</commit_message>
<xml_diff>
--- a/docs/guia_materiales_taller2.docx
+++ b/docs/guia_materiales_taller2.docx
@@ -1,6 +1,6 @@
 
 <file path=word/document.xml><?xml version="1.0" encoding="utf-8"?>
-<w:document xmlns:wpc="http://schemas.microsoft.com/office/word/2010/wordprocessingCanvas" xmlns:cx="http://schemas.microsoft.com/office/drawing/2014/chartex" xmlns:cx1="http://schemas.microsoft.com/office/drawing/2015/9/8/chartex" xmlns:cx2="http://schemas.microsoft.com/office/drawing/2015/10/21/chartex" xmlns:cx3="http://schemas.microsoft.com/office/drawing/2016/5/9/chartex" xmlns:cx4="http://schemas.microsoft.com/office/drawing/2016/5/10/chartex" xmlns:cx5="http://schemas.microsoft.com/office/drawing/2016/5/11/chartex" xmlns:cx6="http://schemas.microsoft.com/office/drawing/2016/5/12/chartex" xmlns:cx7="http://schemas.microsoft.com/office/drawing/2016/5/13/chartex" xmlns:cx8="http://schemas.microsoft.com/office/drawing/2016/5/14/chartex" xmlns:mc="http://schemas.openxmlformats.org/markup-compatibility/2006" xmlns:aink="http://schemas.microsoft.com/office/drawing/2016/ink" xmlns:am3d="http://schemas.microsoft.com/office/drawing/2017/model3d" xmlns:o="urn:schemas-microsoft-com:office:office" xmlns:oel="http://schemas.microsoft.com/office/2019/extlst" xmlns:r="http://schemas.openxmlformats.org/officeDocument/2006/relationships" xmlns:m="http://schemas.openxmlformats.org/officeDocument/2006/math" xmlns:v="urn:schemas-microsoft-com:vml" xmlns:wp14="http://schemas.microsoft.com/office/word/2010/wordprocessingDrawing" xmlns:wp="http://schemas.openxmlformats.org/drawingml/2006/wordprocessingDrawing" xmlns:w10="urn:schemas-microsoft-com:office:word" xmlns:w="http://schemas.openxmlformats.org/wordprocessingml/2006/main" xmlns:w14="http://schemas.microsoft.com/office/word/2010/wordml" xmlns:w15="http://schemas.microsoft.com/office/word/2012/wordml" xmlns:w16cex="http://schemas.microsoft.com/office/word/2018/wordml/cex" xmlns:w16cid="http://schemas.microsoft.com/office/word/2016/wordml/cid" xmlns:w16="http://schemas.microsoft.com/office/word/2018/wordml" xmlns:w16du="http://schemas.microsoft.com/office/word/2023/wordml/word16du" xmlns:w16sdtdh="http://schemas.microsoft.com/office/word/2020/wordml/sdtdatahash" xmlns:w16sdtfl="http://schemas.microsoft.com/office/word/2024/wordml/sdtformatlock" xmlns:w16se="http://schemas.microsoft.com/office/word/2015/wordml/symex" xmlns:wpg="http://schemas.microsoft.com/office/word/2010/wordprocessingGroup" xmlns:wpi="http://schemas.microsoft.com/office/word/2010/wordprocessingInk" xmlns:wne="http://schemas.microsoft.com/office/word/2006/wordml" xmlns:wps="http://schemas.microsoft.com/office/word/2010/wordprocessingShape" mc:Ignorable="w14 w15 w16se w16cid w16 w16cex w16sdtdh w16sdtfl w16du wp14">
+<w:document xmlns:wpc="http://schemas.microsoft.com/office/word/2010/wordprocessingCanvas" xmlns:cx="http://schemas.microsoft.com/office/drawing/2014/chartex" xmlns:cx1="http://schemas.microsoft.com/office/drawing/2015/9/8/chartex" xmlns:cx2="http://schemas.microsoft.com/office/drawing/2015/10/21/chartex" xmlns:cx3="http://schemas.microsoft.com/office/drawing/2016/5/9/chartex" xmlns:cx4="http://schemas.microsoft.com/office/drawing/2016/5/10/chartex" xmlns:cx5="http://schemas.microsoft.com/office/drawing/2016/5/11/chartex" xmlns:cx6="http://schemas.microsoft.com/office/drawing/2016/5/12/chartex" xmlns:cx7="http://schemas.microsoft.com/office/drawing/2016/5/13/chartex" xmlns:cx8="http://schemas.microsoft.com/office/drawing/2016/5/14/chartex" xmlns:mc="http://schemas.openxmlformats.org/markup-compatibility/2006" xmlns:m="http://schemas.openxmlformats.org/officeDocument/2006/math" xmlns:aink="http://schemas.microsoft.com/office/drawing/2016/ink" xmlns:am3d="http://schemas.microsoft.com/office/drawing/2017/model3d" xmlns:oel="http://schemas.microsoft.com/office/2019/extlst" xmlns:r="http://schemas.openxmlformats.org/officeDocument/2006/relationships" xmlns:wp14="http://schemas.microsoft.com/office/word/2010/wordprocessingDrawing" xmlns:wp="http://schemas.openxmlformats.org/drawingml/2006/wordprocessingDrawing" xmlns:wpg="http://schemas.microsoft.com/office/word/2010/wordprocessingGroup" xmlns:wpi="http://schemas.microsoft.com/office/word/2010/wordprocessingInk" xmlns:wps="http://schemas.microsoft.com/office/word/2010/wordprocessingShape" xmlns:o="urn:schemas-microsoft-com:office:office" xmlns:v="urn:schemas-microsoft-com:vml" xmlns:w10="urn:schemas-microsoft-com:office:word" xmlns:w="http://schemas.openxmlformats.org/wordprocessingml/2006/main" xmlns:w14="http://schemas.microsoft.com/office/word/2010/wordml" xmlns:w15="http://schemas.microsoft.com/office/word/2012/wordml" xmlns:w16cex="http://schemas.microsoft.com/office/word/2018/wordml/cex" xmlns:w16cid="http://schemas.microsoft.com/office/word/2016/wordml/cid" xmlns:w16="http://schemas.microsoft.com/office/word/2018/wordml" xmlns:w16sdtdh="http://schemas.microsoft.com/office/word/2020/wordml/sdtdatahash" xmlns:w16sdtfl="http://schemas.microsoft.com/office/word/2024/wordml/sdtformatlock" xmlns:w16se="http://schemas.microsoft.com/office/word/2015/wordml/symex" xmlns:w16du="http://schemas.microsoft.com/office/word/2023/wordml/word16du" xmlns:wne="http://schemas.microsoft.com/office/word/2006/wordml" mc:Ignorable="w14 w15 w16se w16cid w16 w16cex w16sdtdh w16sdtfl w16du wp14">
   <w:body>
     <w:p>
       <w:pPr>
@@ -67,7 +67,15 @@
           <w:sz w:val="22"/>
           <w:szCs w:val="22"/>
         </w:rPr>
-        <w:t>2026-1</w:t>
+        <w:t>2026-</w:t>
+      </w:r>
+      <w:r>
+        <w:rPr>
+          <w:color w:val="000000"/>
+          <w:sz w:val="22"/>
+          <w:szCs w:val="22"/>
+        </w:rPr>
+        <w:t>2</w:t>
       </w:r>
     </w:p>
     <w:p>
@@ -96,40 +104,375 @@
         <w:rPr>
           <w:color w:val="000000"/>
         </w:rPr>
-        <w:t xml:space="preserve">Este documento describe los materiales del Taller 2 del curso, centrado en el diseño e implementación de la tarea Stroop en </w:t>
-      </w:r>
-      <w:proofErr w:type="spellStart"/>
-      <w:r>
-        <w:rPr>
-          <w:color w:val="000000"/>
-        </w:rPr>
-        <w:t>PsychoPy</w:t>
-      </w:r>
-      <w:proofErr w:type="spellEnd"/>
-      <w:r>
-        <w:rPr>
-          <w:color w:val="000000"/>
-        </w:rPr>
-        <w:t xml:space="preserve"> </w:t>
-      </w:r>
-      <w:proofErr w:type="spellStart"/>
-      <w:r>
-        <w:rPr>
-          <w:color w:val="000000"/>
-        </w:rPr>
-        <w:t>Builder</w:t>
-      </w:r>
-      <w:proofErr w:type="spellEnd"/>
-      <w:r>
-        <w:rPr>
-          <w:color w:val="000000"/>
-        </w:rPr>
-        <w:t>. La tarea implementa el paradigma clásico color-palabra con respuestas manuales mediante teclado, introducido originalmente por Stroop (1935) y revisado de forma exhaustiva por MacLeod (1991).</w:t>
+        <w:t>Este documento describe los materiales del Taller 2 del curso, centrado en el diseño e implementación de la tarea Stroop en PsychoPy Builder. La tarea implementa el paradigma clásico color-palabra con respuestas manuales mediante teclado, introducido originalmente por Stroop (1935) y revisado de forma exhaustiva por MacLeod (1991).</w:t>
+      </w:r>
+    </w:p>
+    <w:p>
+      <w:pPr>
+        <w:rPr>
+          <w:b/>
+          <w:bCs/>
+          <w:color w:val="000000"/>
+        </w:rPr>
+      </w:pPr>
+    </w:p>
+    <w:p>
+      <w:pPr>
+        <w:spacing w:line="360" w:lineRule="auto"/>
+        <w:rPr>
+          <w:b/>
+          <w:bCs/>
+          <w:color w:val="000000"/>
+        </w:rPr>
+      </w:pPr>
+      <w:r>
+        <w:rPr>
+          <w:b/>
+          <w:bCs/>
+          <w:color w:val="000000"/>
+        </w:rPr>
+        <w:t>Figura 1</w:t>
+      </w:r>
+    </w:p>
+    <w:p>
+      <w:pPr>
+        <w:spacing w:line="360" w:lineRule="auto"/>
+        <w:rPr>
+          <w:i/>
+          <w:iCs/>
+          <w:color w:val="000000"/>
+        </w:rPr>
+      </w:pPr>
+      <w:r>
+        <w:rPr>
+          <w:i/>
+          <w:iCs/>
+          <w:color w:val="000000"/>
+        </w:rPr>
+        <w:t>Secuencia de fase practica</w:t>
+      </w:r>
+    </w:p>
+    <w:p>
+      <w:pPr>
+        <w:rPr>
+          <w:b/>
+          <w:bCs/>
+          <w:color w:val="000000"/>
+        </w:rPr>
+      </w:pPr>
+      <w:r>
+        <w:rPr>
+          <w:b/>
+          <w:bCs/>
+          <w:noProof/>
+          <w:color w:val="000000"/>
+        </w:rPr>
+        <w:drawing>
+          <wp:inline distT="0" distB="0" distL="0" distR="0" wp14:anchorId="081CC2AD" wp14:editId="46A27AC5">
+            <wp:extent cx="4906191" cy="2738755"/>
+            <wp:effectExtent l="0" t="0" r="0" b="4445"/>
+            <wp:docPr id="1361685400" name="Imagen 2"/>
+            <wp:cNvGraphicFramePr>
+              <a:graphicFrameLocks xmlns:a="http://schemas.openxmlformats.org/drawingml/2006/main" noChangeAspect="1"/>
+            </wp:cNvGraphicFramePr>
+            <a:graphic xmlns:a="http://schemas.openxmlformats.org/drawingml/2006/main">
+              <a:graphicData uri="http://schemas.openxmlformats.org/drawingml/2006/picture">
+                <pic:pic xmlns:pic="http://schemas.openxmlformats.org/drawingml/2006/picture">
+                  <pic:nvPicPr>
+                    <pic:cNvPr id="1361685400" name="Imagen 1361685400"/>
+                    <pic:cNvPicPr/>
+                  </pic:nvPicPr>
+                  <pic:blipFill rotWithShape="1">
+                    <a:blip r:embed="rId7" cstate="print">
+                      <a:extLst>
+                        <a:ext uri="{28A0092B-C50C-407E-A947-70E740481C1C}">
+                          <a14:useLocalDpi xmlns:a14="http://schemas.microsoft.com/office/drawing/2010/main" val="0"/>
+                        </a:ext>
+                      </a:extLst>
+                    </a:blip>
+                    <a:srcRect t="7584"/>
+                    <a:stretch>
+                      <a:fillRect/>
+                    </a:stretch>
+                  </pic:blipFill>
+                  <pic:spPr bwMode="auto">
+                    <a:xfrm>
+                      <a:off x="0" y="0"/>
+                      <a:ext cx="4995469" cy="2788592"/>
+                    </a:xfrm>
+                    <a:prstGeom prst="rect">
+                      <a:avLst/>
+                    </a:prstGeom>
+                    <a:ln>
+                      <a:noFill/>
+                    </a:ln>
+                    <a:extLst>
+                      <a:ext uri="{53640926-AAD7-44D8-BBD7-CCE9431645EC}">
+                        <a14:shadowObscured xmlns:a14="http://schemas.microsoft.com/office/drawing/2010/main"/>
+                      </a:ext>
+                    </a:extLst>
+                  </pic:spPr>
+                </pic:pic>
+              </a:graphicData>
+            </a:graphic>
+          </wp:inline>
+        </w:drawing>
+      </w:r>
+    </w:p>
+    <w:p>
+      <w:pPr>
+        <w:spacing w:line="360" w:lineRule="auto"/>
+        <w:rPr>
+          <w:b/>
+          <w:bCs/>
+          <w:color w:val="000000"/>
+        </w:rPr>
+      </w:pPr>
+      <w:r>
+        <w:rPr>
+          <w:b/>
+          <w:bCs/>
+          <w:color w:val="000000"/>
+        </w:rPr>
+        <w:t>Figura 2</w:t>
+      </w:r>
+    </w:p>
+    <w:p>
+      <w:pPr>
+        <w:spacing w:line="360" w:lineRule="auto"/>
+        <w:rPr>
+          <w:i/>
+          <w:iCs/>
+          <w:color w:val="000000"/>
+        </w:rPr>
+      </w:pPr>
+      <w:r>
+        <w:rPr>
+          <w:i/>
+          <w:iCs/>
+          <w:color w:val="000000"/>
+        </w:rPr>
+        <w:t>Secuencia de fase experimental</w:t>
+      </w:r>
+    </w:p>
+    <w:p>
+      <w:pPr>
+        <w:rPr>
+          <w:b/>
+          <w:bCs/>
+          <w:color w:val="000000"/>
+        </w:rPr>
+      </w:pPr>
+      <w:r>
+        <w:rPr>
+          <w:b/>
+          <w:bCs/>
+          <w:noProof/>
+          <w:color w:val="000000"/>
+        </w:rPr>
+        <w:drawing>
+          <wp:inline distT="0" distB="0" distL="0" distR="0" wp14:anchorId="5BF5EDC3" wp14:editId="43A25BA4">
+            <wp:extent cx="4906010" cy="2738655"/>
+            <wp:effectExtent l="0" t="0" r="0" b="5080"/>
+            <wp:docPr id="1676916758" name="Imagen 1"/>
+            <wp:cNvGraphicFramePr>
+              <a:graphicFrameLocks xmlns:a="http://schemas.openxmlformats.org/drawingml/2006/main" noChangeAspect="1"/>
+            </wp:cNvGraphicFramePr>
+            <a:graphic xmlns:a="http://schemas.openxmlformats.org/drawingml/2006/main">
+              <a:graphicData uri="http://schemas.openxmlformats.org/drawingml/2006/picture">
+                <pic:pic xmlns:pic="http://schemas.openxmlformats.org/drawingml/2006/picture">
+                  <pic:nvPicPr>
+                    <pic:cNvPr id="1676916758" name="Imagen 1676916758"/>
+                    <pic:cNvPicPr/>
+                  </pic:nvPicPr>
+                  <pic:blipFill rotWithShape="1">
+                    <a:blip r:embed="rId8" cstate="print">
+                      <a:extLst>
+                        <a:ext uri="{28A0092B-C50C-407E-A947-70E740481C1C}">
+                          <a14:useLocalDpi xmlns:a14="http://schemas.microsoft.com/office/drawing/2010/main" val="0"/>
+                        </a:ext>
+                      </a:extLst>
+                    </a:blip>
+                    <a:srcRect t="7584"/>
+                    <a:stretch>
+                      <a:fillRect/>
+                    </a:stretch>
+                  </pic:blipFill>
+                  <pic:spPr bwMode="auto">
+                    <a:xfrm>
+                      <a:off x="0" y="0"/>
+                      <a:ext cx="4959657" cy="2768602"/>
+                    </a:xfrm>
+                    <a:prstGeom prst="rect">
+                      <a:avLst/>
+                    </a:prstGeom>
+                    <a:ln>
+                      <a:noFill/>
+                    </a:ln>
+                    <a:extLst>
+                      <a:ext uri="{53640926-AAD7-44D8-BBD7-CCE9431645EC}">
+                        <a14:shadowObscured xmlns:a14="http://schemas.microsoft.com/office/drawing/2010/main"/>
+                      </a:ext>
+                    </a:extLst>
+                  </pic:spPr>
+                </pic:pic>
+              </a:graphicData>
+            </a:graphic>
+          </wp:inline>
+        </w:drawing>
+      </w:r>
+    </w:p>
+    <w:p>
+      <w:pPr>
+        <w:rPr>
+          <w:b/>
+          <w:bCs/>
+          <w:color w:val="000000"/>
+        </w:rPr>
+      </w:pPr>
+      <w:r>
+        <w:rPr>
+          <w:b/>
+          <w:bCs/>
+          <w:color w:val="000000"/>
+        </w:rPr>
+        <w:br w:type="page"/>
+      </w:r>
+    </w:p>
+    <w:p>
+      <w:pPr>
+        <w:rPr>
+          <w:b/>
+          <w:bCs/>
+          <w:color w:val="000000"/>
+        </w:rPr>
+      </w:pPr>
+      <w:r>
+        <w:rPr>
+          <w:b/>
+          <w:bCs/>
+          <w:color w:val="000000"/>
+        </w:rPr>
+        <w:lastRenderedPageBreak/>
+        <w:t>2. Cómo descargar los materiales</w:t>
+      </w:r>
+    </w:p>
+    <w:p>
+      <w:pPr>
+        <w:spacing w:after="120" w:line="276" w:lineRule="auto"/>
+        <w:jc w:val="both"/>
+      </w:pPr>
+      <w:r>
+        <w:rPr>
+          <w:color w:val="000000"/>
+        </w:rPr>
+        <w:t>Seguir los siguientes pasos para obtener todos los archivos necesarios antes del taller:</w:t>
+      </w:r>
+    </w:p>
+    <w:p>
+      <w:pPr>
+        <w:spacing w:before="40" w:after="40" w:line="276" w:lineRule="auto"/>
+        <w:ind w:left="720" w:hanging="360"/>
+        <w:jc w:val="both"/>
+      </w:pPr>
+      <w:r>
+        <w:rPr>
+          <w:color w:val="000000"/>
+        </w:rPr>
+        <w:t>1.</w:t>
+      </w:r>
+      <w:r>
+        <w:rPr>
+          <w:color w:val="000000"/>
+        </w:rPr>
+        <w:tab/>
+        <w:t>Ingresar al repositorio del taller en GitHub.</w:t>
+      </w:r>
+    </w:p>
+    <w:p>
+      <w:pPr>
+        <w:spacing w:before="40" w:after="40" w:line="276" w:lineRule="auto"/>
+        <w:ind w:left="720" w:hanging="360"/>
+        <w:jc w:val="both"/>
+      </w:pPr>
+      <w:r>
+        <w:rPr>
+          <w:color w:val="000000"/>
+        </w:rPr>
+        <w:t>2.</w:t>
+      </w:r>
+      <w:r>
+        <w:rPr>
+          <w:color w:val="000000"/>
+        </w:rPr>
+        <w:tab/>
+        <w:t>Hacer clic en el botón verde Code en la parte superior de la página.</w:t>
+      </w:r>
+    </w:p>
+    <w:p>
+      <w:pPr>
+        <w:spacing w:before="40" w:after="40" w:line="276" w:lineRule="auto"/>
+        <w:ind w:left="720" w:hanging="360"/>
+        <w:jc w:val="both"/>
+      </w:pPr>
+      <w:r>
+        <w:rPr>
+          <w:color w:val="000000"/>
+        </w:rPr>
+        <w:t>3.</w:t>
+      </w:r>
+      <w:r>
+        <w:rPr>
+          <w:color w:val="000000"/>
+        </w:rPr>
+        <w:tab/>
+        <w:t>Seleccionar Download ZIP.</w:t>
+      </w:r>
+    </w:p>
+    <w:p>
+      <w:pPr>
+        <w:spacing w:before="40" w:after="40" w:line="276" w:lineRule="auto"/>
+        <w:ind w:left="720" w:hanging="360"/>
+        <w:jc w:val="both"/>
+      </w:pPr>
+      <w:r>
+        <w:rPr>
+          <w:color w:val="000000"/>
+        </w:rPr>
+        <w:t>4.</w:t>
+      </w:r>
+      <w:r>
+        <w:rPr>
+          <w:color w:val="000000"/>
+        </w:rPr>
+        <w:tab/>
+        <w:t>Descomprimir el archivo en la computadora.</w:t>
+      </w:r>
+    </w:p>
+    <w:p>
+      <w:pPr>
+        <w:spacing w:before="40" w:after="40" w:line="276" w:lineRule="auto"/>
+        <w:ind w:left="720" w:hanging="360"/>
+        <w:jc w:val="both"/>
+      </w:pPr>
+      <w:r>
+        <w:rPr>
+          <w:color w:val="000000"/>
+        </w:rPr>
+        <w:t>5.</w:t>
+      </w:r>
+      <w:r>
+        <w:rPr>
+          <w:color w:val="000000"/>
+        </w:rPr>
+        <w:tab/>
+        <w:t>Abrir PsychoPy Builder y cargar el archivo stroop_task.psyexp.</w:t>
       </w:r>
     </w:p>
     <w:p>
       <w:pPr>
         <w:spacing w:before="80"/>
+        <w:jc w:val="both"/>
       </w:pPr>
     </w:p>
     <w:tbl>
@@ -191,35 +534,7 @@
                 <w:sz w:val="22"/>
                 <w:szCs w:val="22"/>
               </w:rPr>
-              <w:t xml:space="preserve">El </w:t>
-            </w:r>
-            <w:proofErr w:type="gramStart"/>
-            <w:r>
-              <w:rPr>
-                <w:color w:val="000000"/>
-                <w:sz w:val="22"/>
-                <w:szCs w:val="22"/>
-              </w:rPr>
-              <w:t>archivo .</w:t>
-            </w:r>
-            <w:proofErr w:type="spellStart"/>
-            <w:r>
-              <w:rPr>
-                <w:color w:val="000000"/>
-                <w:sz w:val="22"/>
-                <w:szCs w:val="22"/>
-              </w:rPr>
-              <w:t>psyexp</w:t>
-            </w:r>
-            <w:proofErr w:type="spellEnd"/>
-            <w:proofErr w:type="gramEnd"/>
-            <w:r>
-              <w:rPr>
-                <w:color w:val="000000"/>
-                <w:sz w:val="22"/>
-                <w:szCs w:val="22"/>
-              </w:rPr>
-              <w:t xml:space="preserve"> será completado durante el taller. Al finalizar la semana se subirá la versión resuelta al repositorio.</w:t>
+              <w:t>No mover ni renombrar ninguna carpeta. PsychoPy necesita encontrar los archivos exactamente en las rutas que se configurarán durante el taller.</w:t>
             </w:r>
           </w:p>
         </w:tc>
@@ -236,7 +551,7 @@
           <w:bCs/>
           <w:color w:val="000000"/>
         </w:rPr>
-        <w:t>2. Cómo descargar los materiales</w:t>
+        <w:t>3. Estructura del repositorio</w:t>
       </w:r>
     </w:p>
     <w:p>
@@ -248,178 +563,8 @@
         <w:rPr>
           <w:color w:val="000000"/>
         </w:rPr>
-        <w:t>Seguir los siguientes pasos para obtener todos los archivos necesarios antes del taller:</w:t>
-      </w:r>
-    </w:p>
-    <w:p>
-      <w:pPr>
-        <w:spacing w:before="40" w:after="40" w:line="276" w:lineRule="auto"/>
-        <w:ind w:left="720" w:hanging="360"/>
-        <w:jc w:val="both"/>
-      </w:pPr>
-      <w:r>
-        <w:rPr>
-          <w:color w:val="000000"/>
-        </w:rPr>
-        <w:t>1.</w:t>
-      </w:r>
-      <w:r>
-        <w:rPr>
-          <w:color w:val="000000"/>
-        </w:rPr>
-        <w:tab/>
-        <w:t>Ingresar al repositorio del taller en GitHub.</w:t>
-      </w:r>
-    </w:p>
-    <w:p>
-      <w:pPr>
-        <w:spacing w:before="40" w:after="40" w:line="276" w:lineRule="auto"/>
-        <w:ind w:left="720" w:hanging="360"/>
-        <w:jc w:val="both"/>
-      </w:pPr>
-      <w:r>
-        <w:rPr>
-          <w:color w:val="000000"/>
-        </w:rPr>
-        <w:t>2.</w:t>
-      </w:r>
-      <w:r>
-        <w:rPr>
-          <w:color w:val="000000"/>
-        </w:rPr>
-        <w:tab/>
-        <w:t>Hacer clic en el botón verde Code en la parte superior de la página.</w:t>
-      </w:r>
-    </w:p>
-    <w:p>
-      <w:pPr>
-        <w:spacing w:before="40" w:after="40" w:line="276" w:lineRule="auto"/>
-        <w:ind w:left="720" w:hanging="360"/>
-        <w:jc w:val="both"/>
-      </w:pPr>
-      <w:r>
-        <w:rPr>
-          <w:color w:val="000000"/>
-        </w:rPr>
-        <w:t>3.</w:t>
-      </w:r>
-      <w:r>
-        <w:rPr>
-          <w:color w:val="000000"/>
-        </w:rPr>
-        <w:tab/>
-        <w:t xml:space="preserve">Seleccionar </w:t>
-      </w:r>
-      <w:proofErr w:type="spellStart"/>
-      <w:r>
-        <w:rPr>
-          <w:color w:val="000000"/>
-        </w:rPr>
-        <w:t>Download</w:t>
-      </w:r>
-      <w:proofErr w:type="spellEnd"/>
-      <w:r>
-        <w:rPr>
-          <w:color w:val="000000"/>
-        </w:rPr>
-        <w:t xml:space="preserve"> ZIP.</w:t>
-      </w:r>
-    </w:p>
-    <w:p>
-      <w:pPr>
-        <w:spacing w:before="40" w:after="40" w:line="276" w:lineRule="auto"/>
-        <w:ind w:left="720" w:hanging="360"/>
-        <w:jc w:val="both"/>
-      </w:pPr>
-      <w:r>
-        <w:rPr>
-          <w:color w:val="000000"/>
-        </w:rPr>
-        <w:t>4.</w:t>
-      </w:r>
-      <w:r>
-        <w:rPr>
-          <w:color w:val="000000"/>
-        </w:rPr>
-        <w:tab/>
-        <w:t>Descomprimir el archivo en la computadora.</w:t>
-      </w:r>
-    </w:p>
-    <w:p>
-      <w:pPr>
-        <w:spacing w:before="40" w:after="40" w:line="276" w:lineRule="auto"/>
-        <w:ind w:left="720" w:hanging="360"/>
-        <w:jc w:val="both"/>
-      </w:pPr>
-      <w:r>
-        <w:rPr>
-          <w:color w:val="000000"/>
-        </w:rPr>
-        <w:t>5.</w:t>
-      </w:r>
-      <w:r>
-        <w:rPr>
-          <w:color w:val="000000"/>
-        </w:rPr>
-        <w:tab/>
-        <w:t xml:space="preserve">Abrir </w:t>
-      </w:r>
-      <w:proofErr w:type="spellStart"/>
-      <w:r>
-        <w:rPr>
-          <w:color w:val="000000"/>
-        </w:rPr>
-        <w:t>PsychoPy</w:t>
-      </w:r>
-      <w:proofErr w:type="spellEnd"/>
-      <w:r>
-        <w:rPr>
-          <w:color w:val="000000"/>
-        </w:rPr>
-        <w:t xml:space="preserve"> </w:t>
-      </w:r>
-      <w:proofErr w:type="spellStart"/>
-      <w:r>
-        <w:rPr>
-          <w:color w:val="000000"/>
-        </w:rPr>
-        <w:t>Builder</w:t>
-      </w:r>
-      <w:proofErr w:type="spellEnd"/>
-      <w:r>
-        <w:rPr>
-          <w:color w:val="000000"/>
-        </w:rPr>
-        <w:t xml:space="preserve"> y cargar el archivo </w:t>
-      </w:r>
-      <w:proofErr w:type="spellStart"/>
-      <w:r>
-        <w:rPr>
-          <w:color w:val="000000"/>
-        </w:rPr>
-        <w:t>stroop_</w:t>
-      </w:r>
-      <w:proofErr w:type="gramStart"/>
-      <w:r>
-        <w:rPr>
-          <w:color w:val="000000"/>
-        </w:rPr>
-        <w:t>task.psyexp</w:t>
-      </w:r>
-      <w:proofErr w:type="spellEnd"/>
-      <w:proofErr w:type="gramEnd"/>
-      <w:r>
-        <w:rPr>
-          <w:color w:val="000000"/>
-        </w:rPr>
-        <w:t>.</w:t>
-      </w:r>
-    </w:p>
-    <w:p>
-      <w:pPr>
-        <w:spacing w:before="80"/>
-        <w:jc w:val="both"/>
-      </w:pPr>
+        <w:t>Una vez descomprimido el archivo ZIP, la estructura de carpetas debe ser la siguiente:</w:t>
+      </w:r>
     </w:p>
     <w:tbl>
       <w:tblPr>
@@ -451,115 +596,6 @@
               <w:bottom w:val="single" w:sz="4" w:space="0" w:color="AAAAAA"/>
               <w:right w:val="single" w:sz="4" w:space="0" w:color="AAAAAA"/>
             </w:tcBorders>
-            <w:shd w:val="clear" w:color="auto" w:fill="FFFFFF"/>
-            <w:tcMar>
-              <w:top w:w="120" w:type="dxa"/>
-              <w:left w:w="240" w:type="dxa"/>
-              <w:bottom w:w="120" w:type="dxa"/>
-              <w:right w:w="240" w:type="dxa"/>
-            </w:tcMar>
-          </w:tcPr>
-          <w:p>
-            <w:pPr>
-              <w:spacing w:line="276" w:lineRule="auto"/>
-              <w:jc w:val="both"/>
-            </w:pPr>
-            <w:r>
-              <w:rPr>
-                <w:b/>
-                <w:bCs/>
-                <w:color w:val="000000"/>
-                <w:sz w:val="22"/>
-                <w:szCs w:val="22"/>
-              </w:rPr>
-              <w:t xml:space="preserve">Nota. </w:t>
-            </w:r>
-            <w:r>
-              <w:rPr>
-                <w:color w:val="000000"/>
-                <w:sz w:val="22"/>
-                <w:szCs w:val="22"/>
-              </w:rPr>
-              <w:t xml:space="preserve">No mover ni renombrar ninguna carpeta. </w:t>
-            </w:r>
-            <w:proofErr w:type="spellStart"/>
-            <w:r>
-              <w:rPr>
-                <w:color w:val="000000"/>
-                <w:sz w:val="22"/>
-                <w:szCs w:val="22"/>
-              </w:rPr>
-              <w:t>PsychoPy</w:t>
-            </w:r>
-            <w:proofErr w:type="spellEnd"/>
-            <w:r>
-              <w:rPr>
-                <w:color w:val="000000"/>
-                <w:sz w:val="22"/>
-                <w:szCs w:val="22"/>
-              </w:rPr>
-              <w:t xml:space="preserve"> necesita encontrar los archivos exactamente en las rutas que se configurarán durante el taller.</w:t>
-            </w:r>
-          </w:p>
-        </w:tc>
-      </w:tr>
-    </w:tbl>
-    <w:p>
-      <w:pPr>
-        <w:spacing w:before="360" w:after="120" w:line="276" w:lineRule="auto"/>
-        <w:jc w:val="both"/>
-      </w:pPr>
-      <w:r>
-        <w:rPr>
-          <w:b/>
-          <w:bCs/>
-          <w:color w:val="000000"/>
-        </w:rPr>
-        <w:t>3. Estructura del repositorio</w:t>
-      </w:r>
-    </w:p>
-    <w:p>
-      <w:pPr>
-        <w:spacing w:after="120" w:line="276" w:lineRule="auto"/>
-        <w:jc w:val="both"/>
-      </w:pPr>
-      <w:r>
-        <w:rPr>
-          <w:color w:val="000000"/>
-        </w:rPr>
-        <w:t>Una vez descomprimido el archivo ZIP, la estructura de carpetas debe ser la siguiente:</w:t>
-      </w:r>
-    </w:p>
-    <w:tbl>
-      <w:tblPr>
-        <w:tblW w:w="9026" w:type="dxa"/>
-        <w:tblBorders>
-          <w:top w:val="single" w:sz="4" w:space="0" w:color="auto"/>
-          <w:left w:val="single" w:sz="4" w:space="0" w:color="auto"/>
-          <w:bottom w:val="single" w:sz="4" w:space="0" w:color="auto"/>
-          <w:right w:val="single" w:sz="4" w:space="0" w:color="auto"/>
-          <w:insideH w:val="single" w:sz="4" w:space="0" w:color="auto"/>
-          <w:insideV w:val="single" w:sz="4" w:space="0" w:color="auto"/>
-        </w:tblBorders>
-        <w:tblCellMar>
-          <w:left w:w="10" w:type="dxa"/>
-          <w:right w:w="10" w:type="dxa"/>
-        </w:tblCellMar>
-        <w:tblLook w:val="0000" w:firstRow="0" w:lastRow="0" w:firstColumn="0" w:lastColumn="0" w:noHBand="0" w:noVBand="0"/>
-      </w:tblPr>
-      <w:tblGrid>
-        <w:gridCol w:w="9026"/>
-      </w:tblGrid>
-      <w:tr>
-        <w:tc>
-          <w:tcPr>
-            <w:tcW w:w="9026" w:type="dxa"/>
-            <w:tcBorders>
-              <w:top w:val="single" w:sz="4" w:space="0" w:color="AAAAAA"/>
-              <w:left w:val="single" w:sz="4" w:space="0" w:color="AAAAAA"/>
-              <w:bottom w:val="single" w:sz="4" w:space="0" w:color="AAAAAA"/>
-              <w:right w:val="single" w:sz="4" w:space="0" w:color="AAAAAA"/>
-            </w:tcBorders>
             <w:shd w:val="clear" w:color="auto" w:fill="F5F5F5"/>
             <w:tcMar>
               <w:top w:w="140" w:type="dxa"/>
@@ -630,9 +666,17 @@
                 <w:szCs w:val="20"/>
                 <w:lang w:val="en-US"/>
               </w:rPr>
-              <w:t>stroop_</w:t>
-            </w:r>
-            <w:proofErr w:type="gramStart"/>
+              <w:t>stroop_task.psyexp</w:t>
+            </w:r>
+            <w:proofErr w:type="spellEnd"/>
+          </w:p>
+          <w:p>
+            <w:pPr>
+              <w:spacing w:before="20" w:after="20"/>
+              <w:rPr>
+                <w:lang w:val="en-US"/>
+              </w:rPr>
+            </w:pPr>
             <w:r>
               <w:rPr>
                 <w:rFonts w:ascii="Courier New" w:eastAsia="Courier New" w:hAnsi="Courier New" w:cs="Courier New"/>
@@ -641,26 +685,6 @@
                 <w:szCs w:val="20"/>
                 <w:lang w:val="en-US"/>
               </w:rPr>
-              <w:t>task.psyexp</w:t>
-            </w:r>
-            <w:proofErr w:type="spellEnd"/>
-            <w:proofErr w:type="gramEnd"/>
-          </w:p>
-          <w:p>
-            <w:pPr>
-              <w:spacing w:before="20" w:after="20"/>
-              <w:rPr>
-                <w:lang w:val="en-US"/>
-              </w:rPr>
-            </w:pPr>
-            <w:r>
-              <w:rPr>
-                <w:rFonts w:ascii="Courier New" w:eastAsia="Courier New" w:hAnsi="Courier New" w:cs="Courier New"/>
-                <w:color w:val="000000"/>
-                <w:sz w:val="20"/>
-                <w:szCs w:val="20"/>
-                <w:lang w:val="en-US"/>
-              </w:rPr>
               <w:t>│</w:t>
             </w:r>
           </w:p>
@@ -675,27 +699,7 @@
                 <w:sz w:val="20"/>
                 <w:szCs w:val="20"/>
               </w:rPr>
-              <w:t xml:space="preserve">├── </w:t>
-            </w:r>
-            <w:proofErr w:type="spellStart"/>
-            <w:r>
-              <w:rPr>
-                <w:rFonts w:ascii="Courier New" w:eastAsia="Courier New" w:hAnsi="Courier New" w:cs="Courier New"/>
-                <w:color w:val="000000"/>
-                <w:sz w:val="20"/>
-                <w:szCs w:val="20"/>
-              </w:rPr>
-              <w:t>conditions</w:t>
-            </w:r>
-            <w:proofErr w:type="spellEnd"/>
-            <w:r>
-              <w:rPr>
-                <w:rFonts w:ascii="Courier New" w:eastAsia="Courier New" w:hAnsi="Courier New" w:cs="Courier New"/>
-                <w:color w:val="000000"/>
-                <w:sz w:val="20"/>
-                <w:szCs w:val="20"/>
-              </w:rPr>
-              <w:t>/</w:t>
+              <w:t>├── conditions/</w:t>
             </w:r>
           </w:p>
           <w:p>
@@ -709,47 +713,7 @@
                 <w:sz w:val="20"/>
                 <w:szCs w:val="20"/>
               </w:rPr>
-              <w:t>│   ├── condiciones_experimental.xlsx</w:t>
-            </w:r>
-            <w:proofErr w:type="gramStart"/>
-            <w:r>
-              <w:rPr>
-                <w:rFonts w:ascii="Courier New" w:eastAsia="Courier New" w:hAnsi="Courier New" w:cs="Courier New"/>
-                <w:color w:val="000000"/>
-                <w:sz w:val="20"/>
-                <w:szCs w:val="20"/>
-              </w:rPr>
-              <w:t xml:space="preserve">   (</w:t>
-            </w:r>
-            <w:proofErr w:type="gramEnd"/>
-            <w:r>
-              <w:rPr>
-                <w:rFonts w:ascii="Courier New" w:eastAsia="Courier New" w:hAnsi="Courier New" w:cs="Courier New"/>
-                <w:color w:val="000000"/>
-                <w:sz w:val="20"/>
-                <w:szCs w:val="20"/>
-              </w:rPr>
-              <w:t xml:space="preserve">48 </w:t>
-            </w:r>
-            <w:proofErr w:type="spellStart"/>
-            <w:r>
-              <w:rPr>
-                <w:rFonts w:ascii="Courier New" w:eastAsia="Courier New" w:hAnsi="Courier New" w:cs="Courier New"/>
-                <w:color w:val="000000"/>
-                <w:sz w:val="20"/>
-                <w:szCs w:val="20"/>
-              </w:rPr>
-              <w:t>trials</w:t>
-            </w:r>
-            <w:proofErr w:type="spellEnd"/>
-            <w:r>
-              <w:rPr>
-                <w:rFonts w:ascii="Courier New" w:eastAsia="Courier New" w:hAnsi="Courier New" w:cs="Courier New"/>
-                <w:color w:val="000000"/>
-                <w:sz w:val="20"/>
-                <w:szCs w:val="20"/>
-              </w:rPr>
-              <w:t xml:space="preserve"> </w:t>
+              <w:t xml:space="preserve">│   ├── condiciones_experimental.xlsx   (48 trials </w:t>
             </w:r>
             <w:r>
               <w:rPr>
@@ -781,47 +745,7 @@
                 <w:sz w:val="20"/>
                 <w:szCs w:val="20"/>
               </w:rPr>
-              <w:t xml:space="preserve">│   └── condiciones_practica.xlsx     </w:t>
-            </w:r>
-            <w:proofErr w:type="gramStart"/>
-            <w:r>
-              <w:rPr>
-                <w:rFonts w:ascii="Courier New" w:eastAsia="Courier New" w:hAnsi="Courier New" w:cs="Courier New"/>
-                <w:color w:val="000000"/>
-                <w:sz w:val="20"/>
-                <w:szCs w:val="20"/>
-              </w:rPr>
-              <w:t xml:space="preserve">   (</w:t>
-            </w:r>
-            <w:proofErr w:type="gramEnd"/>
-            <w:r>
-              <w:rPr>
-                <w:rFonts w:ascii="Courier New" w:eastAsia="Courier New" w:hAnsi="Courier New" w:cs="Courier New"/>
-                <w:color w:val="000000"/>
-                <w:sz w:val="20"/>
-                <w:szCs w:val="20"/>
-              </w:rPr>
-              <w:t xml:space="preserve">8 </w:t>
-            </w:r>
-            <w:proofErr w:type="spellStart"/>
-            <w:r>
-              <w:rPr>
-                <w:rFonts w:ascii="Courier New" w:eastAsia="Courier New" w:hAnsi="Courier New" w:cs="Courier New"/>
-                <w:color w:val="000000"/>
-                <w:sz w:val="20"/>
-                <w:szCs w:val="20"/>
-              </w:rPr>
-              <w:t>trials</w:t>
-            </w:r>
-            <w:proofErr w:type="spellEnd"/>
-            <w:r>
-              <w:rPr>
-                <w:rFonts w:ascii="Courier New" w:eastAsia="Courier New" w:hAnsi="Courier New" w:cs="Courier New"/>
-                <w:color w:val="000000"/>
-                <w:sz w:val="20"/>
-                <w:szCs w:val="20"/>
-              </w:rPr>
-              <w:t xml:space="preserve"> </w:t>
+              <w:t xml:space="preserve">│   └── condiciones_practica.xlsx        (8 trials </w:t>
             </w:r>
             <w:r>
               <w:rPr>
@@ -867,27 +791,7 @@
                 <w:sz w:val="20"/>
                 <w:szCs w:val="20"/>
               </w:rPr>
-              <w:t xml:space="preserve">├── </w:t>
-            </w:r>
-            <w:proofErr w:type="spellStart"/>
-            <w:r>
-              <w:rPr>
-                <w:rFonts w:ascii="Courier New" w:eastAsia="Courier New" w:hAnsi="Courier New" w:cs="Courier New"/>
-                <w:color w:val="000000"/>
-                <w:sz w:val="20"/>
-                <w:szCs w:val="20"/>
-              </w:rPr>
-              <w:t>docs</w:t>
-            </w:r>
-            <w:proofErr w:type="spellEnd"/>
-            <w:r>
-              <w:rPr>
-                <w:rFonts w:ascii="Courier New" w:eastAsia="Courier New" w:hAnsi="Courier New" w:cs="Courier New"/>
-                <w:color w:val="000000"/>
-                <w:sz w:val="20"/>
-                <w:szCs w:val="20"/>
-              </w:rPr>
-              <w:t>/</w:t>
+              <w:t>├── docs/</w:t>
             </w:r>
           </w:p>
           <w:p>
@@ -901,27 +805,7 @@
                 <w:sz w:val="20"/>
                 <w:szCs w:val="20"/>
               </w:rPr>
-              <w:t xml:space="preserve">│   ├── instrucciones_stroop.docx     </w:t>
-            </w:r>
-            <w:proofErr w:type="gramStart"/>
-            <w:r>
-              <w:rPr>
-                <w:rFonts w:ascii="Courier New" w:eastAsia="Courier New" w:hAnsi="Courier New" w:cs="Courier New"/>
-                <w:color w:val="000000"/>
-                <w:sz w:val="20"/>
-                <w:szCs w:val="20"/>
-              </w:rPr>
-              <w:t xml:space="preserve">   (</w:t>
-            </w:r>
-            <w:proofErr w:type="gramEnd"/>
-            <w:r>
-              <w:rPr>
-                <w:rFonts w:ascii="Courier New" w:eastAsia="Courier New" w:hAnsi="Courier New" w:cs="Courier New"/>
-                <w:color w:val="000000"/>
-                <w:sz w:val="20"/>
-                <w:szCs w:val="20"/>
-              </w:rPr>
-              <w:t>instrucciones por pantalla)</w:t>
+              <w:t>│   ├── instrucciones_stroop.docx        (instrucciones por pantalla)</w:t>
             </w:r>
           </w:p>
           <w:p>
@@ -935,27 +819,7 @@
                 <w:sz w:val="20"/>
                 <w:szCs w:val="20"/>
               </w:rPr>
-              <w:t xml:space="preserve">│   └── guia_materiales_taller2.docx </w:t>
-            </w:r>
-            <w:proofErr w:type="gramStart"/>
-            <w:r>
-              <w:rPr>
-                <w:rFonts w:ascii="Courier New" w:eastAsia="Courier New" w:hAnsi="Courier New" w:cs="Courier New"/>
-                <w:color w:val="000000"/>
-                <w:sz w:val="20"/>
-                <w:szCs w:val="20"/>
-              </w:rPr>
-              <w:t xml:space="preserve">   (</w:t>
-            </w:r>
-            <w:proofErr w:type="gramEnd"/>
-            <w:r>
-              <w:rPr>
-                <w:rFonts w:ascii="Courier New" w:eastAsia="Courier New" w:hAnsi="Courier New" w:cs="Courier New"/>
-                <w:color w:val="000000"/>
-                <w:sz w:val="20"/>
-                <w:szCs w:val="20"/>
-              </w:rPr>
-              <w:t>este documento)</w:t>
+              <w:t>│   └── guia_materiales_taller2.docx    (este documento)</w:t>
             </w:r>
           </w:p>
           <w:p>
@@ -997,67 +861,7 @@
                 <w:sz w:val="20"/>
                 <w:szCs w:val="20"/>
               </w:rPr>
-              <w:t xml:space="preserve">│   └── </w:t>
-            </w:r>
-            <w:proofErr w:type="spellStart"/>
-            <w:r>
-              <w:rPr>
-                <w:rFonts w:ascii="Courier New" w:eastAsia="Courier New" w:hAnsi="Courier New" w:cs="Courier New"/>
-                <w:color w:val="000000"/>
-                <w:sz w:val="20"/>
-                <w:szCs w:val="20"/>
-              </w:rPr>
-              <w:t>instructions</w:t>
-            </w:r>
-            <w:proofErr w:type="spellEnd"/>
-            <w:r>
-              <w:rPr>
-                <w:rFonts w:ascii="Courier New" w:eastAsia="Courier New" w:hAnsi="Courier New" w:cs="Courier New"/>
-                <w:color w:val="000000"/>
-                <w:sz w:val="20"/>
-                <w:szCs w:val="20"/>
-              </w:rPr>
-              <w:t xml:space="preserve">/                </w:t>
-            </w:r>
-            <w:proofErr w:type="gramStart"/>
-            <w:r>
-              <w:rPr>
-                <w:rFonts w:ascii="Courier New" w:eastAsia="Courier New" w:hAnsi="Courier New" w:cs="Courier New"/>
-                <w:color w:val="000000"/>
-                <w:sz w:val="20"/>
-                <w:szCs w:val="20"/>
-              </w:rPr>
-              <w:t xml:space="preserve">   (</w:t>
-            </w:r>
-            <w:proofErr w:type="gramEnd"/>
-            <w:r>
-              <w:rPr>
-                <w:rFonts w:ascii="Courier New" w:eastAsia="Courier New" w:hAnsi="Courier New" w:cs="Courier New"/>
-                <w:color w:val="000000"/>
-                <w:sz w:val="20"/>
-                <w:szCs w:val="20"/>
-              </w:rPr>
-              <w:t xml:space="preserve">instrucciones en .png para </w:t>
-            </w:r>
-            <w:proofErr w:type="spellStart"/>
-            <w:r>
-              <w:rPr>
-                <w:rFonts w:ascii="Courier New" w:eastAsia="Courier New" w:hAnsi="Courier New" w:cs="Courier New"/>
-                <w:color w:val="000000"/>
-                <w:sz w:val="20"/>
-                <w:szCs w:val="20"/>
-              </w:rPr>
-              <w:t>PsychoPy</w:t>
-            </w:r>
-            <w:proofErr w:type="spellEnd"/>
-            <w:r>
-              <w:rPr>
-                <w:rFonts w:ascii="Courier New" w:eastAsia="Courier New" w:hAnsi="Courier New" w:cs="Courier New"/>
-                <w:color w:val="000000"/>
-                <w:sz w:val="20"/>
-                <w:szCs w:val="20"/>
-              </w:rPr>
-              <w:t>)</w:t>
+              <w:t>│   └── instructions/                   (instrucciones en .png para PsychoPy)</w:t>
             </w:r>
           </w:p>
           <w:p>
@@ -1071,7 +875,6 @@
                 <w:sz w:val="20"/>
                 <w:szCs w:val="20"/>
               </w:rPr>
-              <w:lastRenderedPageBreak/>
               <w:t>│       ├── 1_instrucciones.png</w:t>
             </w:r>
           </w:p>
@@ -1222,7 +1025,6 @@
           <w:bCs/>
           <w:color w:val="000000"/>
         </w:rPr>
-        <w:lastRenderedPageBreak/>
         <w:t>4. Diseño de la tarea</w:t>
       </w:r>
     </w:p>
@@ -1429,6 +1231,7 @@
                 <w:sz w:val="22"/>
                 <w:szCs w:val="22"/>
               </w:rPr>
+              <w:lastRenderedPageBreak/>
               <w:t>Colores</w:t>
             </w:r>
           </w:p>
@@ -1573,85 +1376,297 @@
                 <w:sz w:val="22"/>
                 <w:szCs w:val="22"/>
               </w:rPr>
-              <w:t>A (</w:t>
-            </w:r>
-            <w:proofErr w:type="gramStart"/>
+              <w:t>A (rojo)  -  S (verde)  -  K (amarillo)  -  L (azul)</w:t>
+            </w:r>
+          </w:p>
+        </w:tc>
+      </w:tr>
+      <w:tr>
+        <w:tc>
+          <w:tcPr>
+            <w:tcW w:w="4200" w:type="dxa"/>
+            <w:tcBorders>
+              <w:top w:val="none" w:sz="0" w:space="0" w:color="FFFFFF"/>
+              <w:left w:val="none" w:sz="0" w:space="0" w:color="FFFFFF"/>
+              <w:bottom w:val="none" w:sz="0" w:space="0" w:color="FFFFFF"/>
+              <w:right w:val="none" w:sz="0" w:space="0" w:color="FFFFFF"/>
+            </w:tcBorders>
+            <w:shd w:val="clear" w:color="auto" w:fill="FFFFFF"/>
+            <w:tcMar>
+              <w:top w:w="60" w:type="dxa"/>
+              <w:left w:w="0" w:type="dxa"/>
+              <w:bottom w:w="60" w:type="dxa"/>
+              <w:right w:w="120" w:type="dxa"/>
+            </w:tcMar>
+          </w:tcPr>
+          <w:p>
             <w:r>
               <w:rPr>
                 <w:color w:val="000000"/>
                 <w:sz w:val="22"/>
                 <w:szCs w:val="22"/>
               </w:rPr>
-              <w:t xml:space="preserve">rojo)  </w:t>
-            </w:r>
+              <w:t>Trials de práctica</w:t>
+            </w:r>
+          </w:p>
+        </w:tc>
+        <w:tc>
+          <w:tcPr>
+            <w:tcW w:w="4826" w:type="dxa"/>
+            <w:tcBorders>
+              <w:top w:val="none" w:sz="0" w:space="0" w:color="FFFFFF"/>
+              <w:left w:val="none" w:sz="0" w:space="0" w:color="FFFFFF"/>
+              <w:bottom w:val="none" w:sz="0" w:space="0" w:color="FFFFFF"/>
+              <w:right w:val="none" w:sz="0" w:space="0" w:color="FFFFFF"/>
+            </w:tcBorders>
+            <w:shd w:val="clear" w:color="auto" w:fill="FFFFFF"/>
+            <w:tcMar>
+              <w:top w:w="60" w:type="dxa"/>
+              <w:left w:w="0" w:type="dxa"/>
+              <w:bottom w:w="60" w:type="dxa"/>
+              <w:right w:w="120" w:type="dxa"/>
+            </w:tcMar>
+          </w:tcPr>
+          <w:p>
             <w:r>
               <w:rPr>
                 <w:color w:val="000000"/>
                 <w:sz w:val="22"/>
                 <w:szCs w:val="22"/>
               </w:rPr>
-              <w:t>-</w:t>
-            </w:r>
-            <w:proofErr w:type="gramEnd"/>
+              <w:t>8 (1 congruente + 1 incongruente por color, con feedback)</w:t>
+            </w:r>
+          </w:p>
+        </w:tc>
+      </w:tr>
+      <w:tr>
+        <w:tc>
+          <w:tcPr>
+            <w:tcW w:w="4200" w:type="dxa"/>
+            <w:tcBorders>
+              <w:top w:val="none" w:sz="0" w:space="0" w:color="FFFFFF"/>
+              <w:left w:val="none" w:sz="0" w:space="0" w:color="FFFFFF"/>
+              <w:bottom w:val="none" w:sz="0" w:space="0" w:color="FFFFFF"/>
+              <w:right w:val="none" w:sz="0" w:space="0" w:color="FFFFFF"/>
+            </w:tcBorders>
+            <w:shd w:val="clear" w:color="auto" w:fill="FFFFFF"/>
+            <w:tcMar>
+              <w:top w:w="60" w:type="dxa"/>
+              <w:left w:w="0" w:type="dxa"/>
+              <w:bottom w:w="60" w:type="dxa"/>
+              <w:right w:w="120" w:type="dxa"/>
+            </w:tcMar>
+          </w:tcPr>
+          <w:p>
             <w:r>
               <w:rPr>
                 <w:color w:val="000000"/>
                 <w:sz w:val="22"/>
                 <w:szCs w:val="22"/>
               </w:rPr>
-              <w:t xml:space="preserve">  S (</w:t>
-            </w:r>
-            <w:proofErr w:type="gramStart"/>
+              <w:t>Trials experimentales</w:t>
+            </w:r>
+          </w:p>
+        </w:tc>
+        <w:tc>
+          <w:tcPr>
+            <w:tcW w:w="4826" w:type="dxa"/>
+            <w:tcBorders>
+              <w:top w:val="none" w:sz="0" w:space="0" w:color="FFFFFF"/>
+              <w:left w:val="none" w:sz="0" w:space="0" w:color="FFFFFF"/>
+              <w:bottom w:val="none" w:sz="0" w:space="0" w:color="FFFFFF"/>
+              <w:right w:val="none" w:sz="0" w:space="0" w:color="FFFFFF"/>
+            </w:tcBorders>
+            <w:shd w:val="clear" w:color="auto" w:fill="FFFFFF"/>
+            <w:tcMar>
+              <w:top w:w="60" w:type="dxa"/>
+              <w:left w:w="0" w:type="dxa"/>
+              <w:bottom w:w="60" w:type="dxa"/>
+              <w:right w:w="120" w:type="dxa"/>
+            </w:tcMar>
+          </w:tcPr>
+          <w:p>
             <w:r>
               <w:rPr>
                 <w:color w:val="000000"/>
                 <w:sz w:val="22"/>
                 <w:szCs w:val="22"/>
               </w:rPr>
-              <w:t xml:space="preserve">verde)  </w:t>
-            </w:r>
+              <w:t>48 (6 congruentes + 6 incongruentes por color)</w:t>
+            </w:r>
+          </w:p>
+        </w:tc>
+      </w:tr>
+      <w:tr>
+        <w:tc>
+          <w:tcPr>
+            <w:tcW w:w="4200" w:type="dxa"/>
+            <w:tcBorders>
+              <w:top w:val="none" w:sz="0" w:space="0" w:color="FFFFFF"/>
+              <w:left w:val="none" w:sz="0" w:space="0" w:color="FFFFFF"/>
+              <w:bottom w:val="none" w:sz="0" w:space="0" w:color="FFFFFF"/>
+              <w:right w:val="none" w:sz="0" w:space="0" w:color="FFFFFF"/>
+            </w:tcBorders>
+            <w:shd w:val="clear" w:color="auto" w:fill="FFFFFF"/>
+            <w:tcMar>
+              <w:top w:w="60" w:type="dxa"/>
+              <w:left w:w="0" w:type="dxa"/>
+              <w:bottom w:w="60" w:type="dxa"/>
+              <w:right w:w="120" w:type="dxa"/>
+            </w:tcMar>
+          </w:tcPr>
+          <w:p>
             <w:r>
               <w:rPr>
                 <w:color w:val="000000"/>
                 <w:sz w:val="22"/>
                 <w:szCs w:val="22"/>
               </w:rPr>
-              <w:t>-</w:t>
-            </w:r>
-            <w:proofErr w:type="gramEnd"/>
+              <w:t>Tiempo límite por trial</w:t>
+            </w:r>
+          </w:p>
+        </w:tc>
+        <w:tc>
+          <w:tcPr>
+            <w:tcW w:w="4826" w:type="dxa"/>
+            <w:tcBorders>
+              <w:top w:val="none" w:sz="0" w:space="0" w:color="FFFFFF"/>
+              <w:left w:val="none" w:sz="0" w:space="0" w:color="FFFFFF"/>
+              <w:bottom w:val="none" w:sz="0" w:space="0" w:color="FFFFFF"/>
+              <w:right w:val="none" w:sz="0" w:space="0" w:color="FFFFFF"/>
+            </w:tcBorders>
+            <w:shd w:val="clear" w:color="auto" w:fill="FFFFFF"/>
+            <w:tcMar>
+              <w:top w:w="60" w:type="dxa"/>
+              <w:left w:w="0" w:type="dxa"/>
+              <w:bottom w:w="60" w:type="dxa"/>
+              <w:right w:w="120" w:type="dxa"/>
+            </w:tcMar>
+          </w:tcPr>
+          <w:p>
             <w:r>
               <w:rPr>
                 <w:color w:val="000000"/>
                 <w:sz w:val="22"/>
                 <w:szCs w:val="22"/>
               </w:rPr>
-              <w:t xml:space="preserve">  K (</w:t>
-            </w:r>
-            <w:proofErr w:type="gramStart"/>
+              <w:t>1500 ms</w:t>
+            </w:r>
+          </w:p>
+        </w:tc>
+      </w:tr>
+      <w:tr>
+        <w:tc>
+          <w:tcPr>
+            <w:tcW w:w="4200" w:type="dxa"/>
+            <w:tcBorders>
+              <w:top w:val="none" w:sz="0" w:space="0" w:color="FFFFFF"/>
+              <w:left w:val="none" w:sz="0" w:space="0" w:color="FFFFFF"/>
+              <w:bottom w:val="none" w:sz="0" w:space="0" w:color="FFFFFF"/>
+              <w:right w:val="none" w:sz="0" w:space="0" w:color="FFFFFF"/>
+            </w:tcBorders>
+            <w:shd w:val="clear" w:color="auto" w:fill="FFFFFF"/>
+            <w:tcMar>
+              <w:top w:w="60" w:type="dxa"/>
+              <w:left w:w="0" w:type="dxa"/>
+              <w:bottom w:w="60" w:type="dxa"/>
+              <w:right w:w="120" w:type="dxa"/>
+            </w:tcMar>
+          </w:tcPr>
+          <w:p>
             <w:r>
               <w:rPr>
                 <w:color w:val="000000"/>
                 <w:sz w:val="22"/>
                 <w:szCs w:val="22"/>
               </w:rPr>
-              <w:t xml:space="preserve">amarillo)  </w:t>
-            </w:r>
+              <w:t>ITI</w:t>
+            </w:r>
+          </w:p>
+        </w:tc>
+        <w:tc>
+          <w:tcPr>
+            <w:tcW w:w="4826" w:type="dxa"/>
+            <w:tcBorders>
+              <w:top w:val="none" w:sz="0" w:space="0" w:color="FFFFFF"/>
+              <w:left w:val="none" w:sz="0" w:space="0" w:color="FFFFFF"/>
+              <w:bottom w:val="none" w:sz="0" w:space="0" w:color="FFFFFF"/>
+              <w:right w:val="none" w:sz="0" w:space="0" w:color="FFFFFF"/>
+            </w:tcBorders>
+            <w:shd w:val="clear" w:color="auto" w:fill="FFFFFF"/>
+            <w:tcMar>
+              <w:top w:w="60" w:type="dxa"/>
+              <w:left w:w="0" w:type="dxa"/>
+              <w:bottom w:w="60" w:type="dxa"/>
+              <w:right w:w="120" w:type="dxa"/>
+            </w:tcMar>
+          </w:tcPr>
+          <w:p>
             <w:r>
               <w:rPr>
                 <w:color w:val="000000"/>
                 <w:sz w:val="22"/>
                 <w:szCs w:val="22"/>
               </w:rPr>
-              <w:t>-</w:t>
-            </w:r>
-            <w:proofErr w:type="gramEnd"/>
+              <w:t>500 ms</w:t>
+            </w:r>
+          </w:p>
+        </w:tc>
+      </w:tr>
+      <w:tr>
+        <w:tc>
+          <w:tcPr>
+            <w:tcW w:w="4200" w:type="dxa"/>
+            <w:tcBorders>
+              <w:top w:val="none" w:sz="0" w:space="0" w:color="FFFFFF"/>
+              <w:left w:val="none" w:sz="0" w:space="0" w:color="FFFFFF"/>
+              <w:bottom w:val="none" w:sz="0" w:space="0" w:color="FFFFFF"/>
+              <w:right w:val="none" w:sz="0" w:space="0" w:color="FFFFFF"/>
+            </w:tcBorders>
+            <w:shd w:val="clear" w:color="auto" w:fill="FFFFFF"/>
+            <w:tcMar>
+              <w:top w:w="60" w:type="dxa"/>
+              <w:left w:w="0" w:type="dxa"/>
+              <w:bottom w:w="60" w:type="dxa"/>
+              <w:right w:w="120" w:type="dxa"/>
+            </w:tcMar>
+          </w:tcPr>
+          <w:p>
             <w:r>
               <w:rPr>
                 <w:color w:val="000000"/>
                 <w:sz w:val="22"/>
                 <w:szCs w:val="22"/>
               </w:rPr>
-              <w:t xml:space="preserve">  L (azul)</w:t>
+              <w:t>Feedback</w:t>
+            </w:r>
+          </w:p>
+        </w:tc>
+        <w:tc>
+          <w:tcPr>
+            <w:tcW w:w="4826" w:type="dxa"/>
+            <w:tcBorders>
+              <w:top w:val="none" w:sz="0" w:space="0" w:color="FFFFFF"/>
+              <w:left w:val="none" w:sz="0" w:space="0" w:color="FFFFFF"/>
+              <w:bottom w:val="none" w:sz="0" w:space="0" w:color="FFFFFF"/>
+              <w:right w:val="none" w:sz="0" w:space="0" w:color="FFFFFF"/>
+            </w:tcBorders>
+            <w:shd w:val="clear" w:color="auto" w:fill="FFFFFF"/>
+            <w:tcMar>
+              <w:top w:w="60" w:type="dxa"/>
+              <w:left w:w="0" w:type="dxa"/>
+              <w:bottom w:w="60" w:type="dxa"/>
+              <w:right w:w="120" w:type="dxa"/>
+            </w:tcMar>
+          </w:tcPr>
+          <w:p>
+            <w:r>
+              <w:rPr>
+                <w:color w:val="000000"/>
+                <w:sz w:val="22"/>
+                <w:szCs w:val="22"/>
+              </w:rPr>
+              <w:t>Solo en fase de práctica</w:t>
             </w:r>
           </w:p>
         </w:tc>
@@ -1663,7 +1678,7 @@
             <w:tcBorders>
               <w:top w:val="none" w:sz="0" w:space="0" w:color="FFFFFF"/>
               <w:left w:val="none" w:sz="0" w:space="0" w:color="FFFFFF"/>
-              <w:bottom w:val="none" w:sz="0" w:space="0" w:color="FFFFFF"/>
+              <w:bottom w:val="single" w:sz="12" w:space="0" w:color="000000"/>
               <w:right w:val="none" w:sz="0" w:space="0" w:color="FFFFFF"/>
             </w:tcBorders>
             <w:shd w:val="clear" w:color="auto" w:fill="FFFFFF"/>
@@ -1675,23 +1690,21 @@
             </w:tcMar>
           </w:tcPr>
           <w:p>
-            <w:proofErr w:type="spellStart"/>
             <w:r>
               <w:rPr>
                 <w:color w:val="000000"/>
                 <w:sz w:val="22"/>
                 <w:szCs w:val="22"/>
               </w:rPr>
-              <w:t>Trials</w:t>
-            </w:r>
-            <w:proofErr w:type="spellEnd"/>
+              <w:t>Variables</w:t>
+            </w:r>
             <w:r>
               <w:rPr>
                 <w:color w:val="000000"/>
                 <w:sz w:val="22"/>
                 <w:szCs w:val="22"/>
               </w:rPr>
-              <w:t xml:space="preserve"> de práctica</w:t>
+              <w:t xml:space="preserve"> de la tarea</w:t>
             </w:r>
           </w:p>
         </w:tc>
@@ -1701,7 +1714,7 @@
             <w:tcBorders>
               <w:top w:val="none" w:sz="0" w:space="0" w:color="FFFFFF"/>
               <w:left w:val="none" w:sz="0" w:space="0" w:color="FFFFFF"/>
-              <w:bottom w:val="none" w:sz="0" w:space="0" w:color="FFFFFF"/>
+              <w:bottom w:val="single" w:sz="12" w:space="0" w:color="000000"/>
               <w:right w:val="none" w:sz="0" w:space="0" w:color="FFFFFF"/>
             </w:tcBorders>
             <w:shd w:val="clear" w:color="auto" w:fill="FFFFFF"/>
@@ -1719,334 +1732,6 @@
                 <w:sz w:val="22"/>
                 <w:szCs w:val="22"/>
               </w:rPr>
-              <w:t xml:space="preserve">8 (1 congruente + 1 incongruente por color, con </w:t>
-            </w:r>
-            <w:proofErr w:type="spellStart"/>
-            <w:r>
-              <w:rPr>
-                <w:color w:val="000000"/>
-                <w:sz w:val="22"/>
-                <w:szCs w:val="22"/>
-              </w:rPr>
-              <w:t>feedback</w:t>
-            </w:r>
-            <w:proofErr w:type="spellEnd"/>
-            <w:r>
-              <w:rPr>
-                <w:color w:val="000000"/>
-                <w:sz w:val="22"/>
-                <w:szCs w:val="22"/>
-              </w:rPr>
-              <w:t>)</w:t>
-            </w:r>
-          </w:p>
-        </w:tc>
-      </w:tr>
-      <w:tr>
-        <w:tc>
-          <w:tcPr>
-            <w:tcW w:w="4200" w:type="dxa"/>
-            <w:tcBorders>
-              <w:top w:val="none" w:sz="0" w:space="0" w:color="FFFFFF"/>
-              <w:left w:val="none" w:sz="0" w:space="0" w:color="FFFFFF"/>
-              <w:bottom w:val="none" w:sz="0" w:space="0" w:color="FFFFFF"/>
-              <w:right w:val="none" w:sz="0" w:space="0" w:color="FFFFFF"/>
-            </w:tcBorders>
-            <w:shd w:val="clear" w:color="auto" w:fill="FFFFFF"/>
-            <w:tcMar>
-              <w:top w:w="60" w:type="dxa"/>
-              <w:left w:w="0" w:type="dxa"/>
-              <w:bottom w:w="60" w:type="dxa"/>
-              <w:right w:w="120" w:type="dxa"/>
-            </w:tcMar>
-          </w:tcPr>
-          <w:p>
-            <w:proofErr w:type="spellStart"/>
-            <w:r>
-              <w:rPr>
-                <w:color w:val="000000"/>
-                <w:sz w:val="22"/>
-                <w:szCs w:val="22"/>
-              </w:rPr>
-              <w:t>Trials</w:t>
-            </w:r>
-            <w:proofErr w:type="spellEnd"/>
-            <w:r>
-              <w:rPr>
-                <w:color w:val="000000"/>
-                <w:sz w:val="22"/>
-                <w:szCs w:val="22"/>
-              </w:rPr>
-              <w:t xml:space="preserve"> experimentales</w:t>
-            </w:r>
-          </w:p>
-        </w:tc>
-        <w:tc>
-          <w:tcPr>
-            <w:tcW w:w="4826" w:type="dxa"/>
-            <w:tcBorders>
-              <w:top w:val="none" w:sz="0" w:space="0" w:color="FFFFFF"/>
-              <w:left w:val="none" w:sz="0" w:space="0" w:color="FFFFFF"/>
-              <w:bottom w:val="none" w:sz="0" w:space="0" w:color="FFFFFF"/>
-              <w:right w:val="none" w:sz="0" w:space="0" w:color="FFFFFF"/>
-            </w:tcBorders>
-            <w:shd w:val="clear" w:color="auto" w:fill="FFFFFF"/>
-            <w:tcMar>
-              <w:top w:w="60" w:type="dxa"/>
-              <w:left w:w="0" w:type="dxa"/>
-              <w:bottom w:w="60" w:type="dxa"/>
-              <w:right w:w="120" w:type="dxa"/>
-            </w:tcMar>
-          </w:tcPr>
-          <w:p>
-            <w:r>
-              <w:rPr>
-                <w:color w:val="000000"/>
-                <w:sz w:val="22"/>
-                <w:szCs w:val="22"/>
-              </w:rPr>
-              <w:t>48 (6 congruentes + 6 incongruentes por color)</w:t>
-            </w:r>
-          </w:p>
-        </w:tc>
-      </w:tr>
-      <w:tr>
-        <w:tc>
-          <w:tcPr>
-            <w:tcW w:w="4200" w:type="dxa"/>
-            <w:tcBorders>
-              <w:top w:val="none" w:sz="0" w:space="0" w:color="FFFFFF"/>
-              <w:left w:val="none" w:sz="0" w:space="0" w:color="FFFFFF"/>
-              <w:bottom w:val="none" w:sz="0" w:space="0" w:color="FFFFFF"/>
-              <w:right w:val="none" w:sz="0" w:space="0" w:color="FFFFFF"/>
-            </w:tcBorders>
-            <w:shd w:val="clear" w:color="auto" w:fill="FFFFFF"/>
-            <w:tcMar>
-              <w:top w:w="60" w:type="dxa"/>
-              <w:left w:w="0" w:type="dxa"/>
-              <w:bottom w:w="60" w:type="dxa"/>
-              <w:right w:w="120" w:type="dxa"/>
-            </w:tcMar>
-          </w:tcPr>
-          <w:p>
-            <w:r>
-              <w:rPr>
-                <w:color w:val="000000"/>
-                <w:sz w:val="22"/>
-                <w:szCs w:val="22"/>
-              </w:rPr>
-              <w:t>Tiempo límite por trial</w:t>
-            </w:r>
-          </w:p>
-        </w:tc>
-        <w:tc>
-          <w:tcPr>
-            <w:tcW w:w="4826" w:type="dxa"/>
-            <w:tcBorders>
-              <w:top w:val="none" w:sz="0" w:space="0" w:color="FFFFFF"/>
-              <w:left w:val="none" w:sz="0" w:space="0" w:color="FFFFFF"/>
-              <w:bottom w:val="none" w:sz="0" w:space="0" w:color="FFFFFF"/>
-              <w:right w:val="none" w:sz="0" w:space="0" w:color="FFFFFF"/>
-            </w:tcBorders>
-            <w:shd w:val="clear" w:color="auto" w:fill="FFFFFF"/>
-            <w:tcMar>
-              <w:top w:w="60" w:type="dxa"/>
-              <w:left w:w="0" w:type="dxa"/>
-              <w:bottom w:w="60" w:type="dxa"/>
-              <w:right w:w="120" w:type="dxa"/>
-            </w:tcMar>
-          </w:tcPr>
-          <w:p>
-            <w:r>
-              <w:rPr>
-                <w:color w:val="000000"/>
-                <w:sz w:val="22"/>
-                <w:szCs w:val="22"/>
-              </w:rPr>
-              <w:t>1500 ms</w:t>
-            </w:r>
-          </w:p>
-        </w:tc>
-      </w:tr>
-      <w:tr>
-        <w:tc>
-          <w:tcPr>
-            <w:tcW w:w="4200" w:type="dxa"/>
-            <w:tcBorders>
-              <w:top w:val="none" w:sz="0" w:space="0" w:color="FFFFFF"/>
-              <w:left w:val="none" w:sz="0" w:space="0" w:color="FFFFFF"/>
-              <w:bottom w:val="none" w:sz="0" w:space="0" w:color="FFFFFF"/>
-              <w:right w:val="none" w:sz="0" w:space="0" w:color="FFFFFF"/>
-            </w:tcBorders>
-            <w:shd w:val="clear" w:color="auto" w:fill="FFFFFF"/>
-            <w:tcMar>
-              <w:top w:w="60" w:type="dxa"/>
-              <w:left w:w="0" w:type="dxa"/>
-              <w:bottom w:w="60" w:type="dxa"/>
-              <w:right w:w="120" w:type="dxa"/>
-            </w:tcMar>
-          </w:tcPr>
-          <w:p>
-            <w:r>
-              <w:rPr>
-                <w:color w:val="000000"/>
-                <w:sz w:val="22"/>
-                <w:szCs w:val="22"/>
-              </w:rPr>
-              <w:t>ITI</w:t>
-            </w:r>
-          </w:p>
-        </w:tc>
-        <w:tc>
-          <w:tcPr>
-            <w:tcW w:w="4826" w:type="dxa"/>
-            <w:tcBorders>
-              <w:top w:val="none" w:sz="0" w:space="0" w:color="FFFFFF"/>
-              <w:left w:val="none" w:sz="0" w:space="0" w:color="FFFFFF"/>
-              <w:bottom w:val="none" w:sz="0" w:space="0" w:color="FFFFFF"/>
-              <w:right w:val="none" w:sz="0" w:space="0" w:color="FFFFFF"/>
-            </w:tcBorders>
-            <w:shd w:val="clear" w:color="auto" w:fill="FFFFFF"/>
-            <w:tcMar>
-              <w:top w:w="60" w:type="dxa"/>
-              <w:left w:w="0" w:type="dxa"/>
-              <w:bottom w:w="60" w:type="dxa"/>
-              <w:right w:w="120" w:type="dxa"/>
-            </w:tcMar>
-          </w:tcPr>
-          <w:p>
-            <w:r>
-              <w:rPr>
-                <w:color w:val="000000"/>
-                <w:sz w:val="22"/>
-                <w:szCs w:val="22"/>
-              </w:rPr>
-              <w:t>500 ms</w:t>
-            </w:r>
-          </w:p>
-        </w:tc>
-      </w:tr>
-      <w:tr>
-        <w:tc>
-          <w:tcPr>
-            <w:tcW w:w="4200" w:type="dxa"/>
-            <w:tcBorders>
-              <w:top w:val="none" w:sz="0" w:space="0" w:color="FFFFFF"/>
-              <w:left w:val="none" w:sz="0" w:space="0" w:color="FFFFFF"/>
-              <w:bottom w:val="none" w:sz="0" w:space="0" w:color="FFFFFF"/>
-              <w:right w:val="none" w:sz="0" w:space="0" w:color="FFFFFF"/>
-            </w:tcBorders>
-            <w:shd w:val="clear" w:color="auto" w:fill="FFFFFF"/>
-            <w:tcMar>
-              <w:top w:w="60" w:type="dxa"/>
-              <w:left w:w="0" w:type="dxa"/>
-              <w:bottom w:w="60" w:type="dxa"/>
-              <w:right w:w="120" w:type="dxa"/>
-            </w:tcMar>
-          </w:tcPr>
-          <w:p>
-            <w:proofErr w:type="spellStart"/>
-            <w:r>
-              <w:rPr>
-                <w:color w:val="000000"/>
-                <w:sz w:val="22"/>
-                <w:szCs w:val="22"/>
-              </w:rPr>
-              <w:t>Feedback</w:t>
-            </w:r>
-            <w:proofErr w:type="spellEnd"/>
-          </w:p>
-        </w:tc>
-        <w:tc>
-          <w:tcPr>
-            <w:tcW w:w="4826" w:type="dxa"/>
-            <w:tcBorders>
-              <w:top w:val="none" w:sz="0" w:space="0" w:color="FFFFFF"/>
-              <w:left w:val="none" w:sz="0" w:space="0" w:color="FFFFFF"/>
-              <w:bottom w:val="none" w:sz="0" w:space="0" w:color="FFFFFF"/>
-              <w:right w:val="none" w:sz="0" w:space="0" w:color="FFFFFF"/>
-            </w:tcBorders>
-            <w:shd w:val="clear" w:color="auto" w:fill="FFFFFF"/>
-            <w:tcMar>
-              <w:top w:w="60" w:type="dxa"/>
-              <w:left w:w="0" w:type="dxa"/>
-              <w:bottom w:w="60" w:type="dxa"/>
-              <w:right w:w="120" w:type="dxa"/>
-            </w:tcMar>
-          </w:tcPr>
-          <w:p>
-            <w:r>
-              <w:rPr>
-                <w:color w:val="000000"/>
-                <w:sz w:val="22"/>
-                <w:szCs w:val="22"/>
-              </w:rPr>
-              <w:t>Solo en fase de práctica</w:t>
-            </w:r>
-          </w:p>
-        </w:tc>
-      </w:tr>
-      <w:tr>
-        <w:tc>
-          <w:tcPr>
-            <w:tcW w:w="4200" w:type="dxa"/>
-            <w:tcBorders>
-              <w:top w:val="none" w:sz="0" w:space="0" w:color="FFFFFF"/>
-              <w:left w:val="none" w:sz="0" w:space="0" w:color="FFFFFF"/>
-              <w:bottom w:val="single" w:sz="12" w:space="0" w:color="000000"/>
-              <w:right w:val="none" w:sz="0" w:space="0" w:color="FFFFFF"/>
-            </w:tcBorders>
-            <w:shd w:val="clear" w:color="auto" w:fill="FFFFFF"/>
-            <w:tcMar>
-              <w:top w:w="60" w:type="dxa"/>
-              <w:left w:w="0" w:type="dxa"/>
-              <w:bottom w:w="60" w:type="dxa"/>
-              <w:right w:w="120" w:type="dxa"/>
-            </w:tcMar>
-          </w:tcPr>
-          <w:p>
-            <w:r>
-              <w:rPr>
-                <w:color w:val="000000"/>
-                <w:sz w:val="22"/>
-                <w:szCs w:val="22"/>
-              </w:rPr>
-              <w:t>Variables</w:t>
-            </w:r>
-            <w:r>
-              <w:rPr>
-                <w:color w:val="000000"/>
-                <w:sz w:val="22"/>
-                <w:szCs w:val="22"/>
-              </w:rPr>
-              <w:t xml:space="preserve"> de la tarea</w:t>
-            </w:r>
-          </w:p>
-        </w:tc>
-        <w:tc>
-          <w:tcPr>
-            <w:tcW w:w="4826" w:type="dxa"/>
-            <w:tcBorders>
-              <w:top w:val="none" w:sz="0" w:space="0" w:color="FFFFFF"/>
-              <w:left w:val="none" w:sz="0" w:space="0" w:color="FFFFFF"/>
-              <w:bottom w:val="single" w:sz="12" w:space="0" w:color="000000"/>
-              <w:right w:val="none" w:sz="0" w:space="0" w:color="FFFFFF"/>
-            </w:tcBorders>
-            <w:shd w:val="clear" w:color="auto" w:fill="FFFFFF"/>
-            <w:tcMar>
-              <w:top w:w="60" w:type="dxa"/>
-              <w:left w:w="0" w:type="dxa"/>
-              <w:bottom w:w="60" w:type="dxa"/>
-              <w:right w:w="120" w:type="dxa"/>
-            </w:tcMar>
-          </w:tcPr>
-          <w:p>
-            <w:r>
-              <w:rPr>
-                <w:color w:val="000000"/>
-                <w:sz w:val="22"/>
-                <w:szCs w:val="22"/>
-              </w:rPr>
               <w:t>Precisión (% correcto), RT (ms) y Efecto Stroop</w:t>
             </w:r>
           </w:p>
@@ -2079,39 +1764,28 @@
     </w:p>
     <w:p>
       <w:pPr>
-        <w:spacing w:before="200" w:after="80" w:line="276" w:lineRule="auto"/>
-        <w:rPr>
-          <w:color w:val="000000"/>
-        </w:rPr>
-      </w:pPr>
-      <w:r>
-        <w:rPr>
-          <w:color w:val="000000"/>
-        </w:rPr>
-        <w:t xml:space="preserve">Flujo de </w:t>
-      </w:r>
-      <w:proofErr w:type="spellStart"/>
-      <w:r>
-        <w:rPr>
-          <w:color w:val="000000"/>
-        </w:rPr>
-        <w:t>routines</w:t>
-      </w:r>
-      <w:proofErr w:type="spellEnd"/>
-    </w:p>
-    <w:p>
+        <w:spacing w:line="360" w:lineRule="auto"/>
+      </w:pPr>
       <w:r>
         <w:rPr>
           <w:b/>
           <w:bCs/>
           <w:color w:val="000000"/>
         </w:rPr>
-        <w:t>Figura 1</w:t>
-      </w:r>
-    </w:p>
-    <w:p>
-      <w:pPr>
-        <w:spacing w:after="120"/>
+        <w:t xml:space="preserve">Figura </w:t>
+      </w:r>
+      <w:r>
+        <w:rPr>
+          <w:b/>
+          <w:bCs/>
+          <w:color w:val="000000"/>
+        </w:rPr>
+        <w:t>3</w:t>
+      </w:r>
+    </w:p>
+    <w:p>
+      <w:pPr>
+        <w:spacing w:after="120" w:line="360" w:lineRule="auto"/>
       </w:pPr>
       <w:r>
         <w:rPr>
@@ -2119,36 +1793,8 @@
           <w:iCs/>
           <w:color w:val="000000"/>
         </w:rPr>
-        <w:t xml:space="preserve">Gráfico del flujo de </w:t>
-      </w:r>
-      <w:proofErr w:type="spellStart"/>
-      <w:r>
-        <w:rPr>
-          <w:i/>
-          <w:iCs/>
-          <w:color w:val="000000"/>
-        </w:rPr>
-        <w:t>routines</w:t>
-      </w:r>
-      <w:proofErr w:type="spellEnd"/>
-      <w:r>
-        <w:rPr>
-          <w:i/>
-          <w:iCs/>
-          <w:color w:val="000000"/>
-        </w:rPr>
-        <w:t xml:space="preserve"> de la tarea </w:t>
-      </w:r>
-      <w:proofErr w:type="spellStart"/>
-      <w:r>
-        <w:rPr>
-          <w:i/>
-          <w:iCs/>
-          <w:color w:val="000000"/>
-        </w:rPr>
-        <w:t>stroop</w:t>
-      </w:r>
-      <w:proofErr w:type="spellEnd"/>
+        <w:t>Gráfico del flujo de routines de la tarea stroop</w:t>
+      </w:r>
     </w:p>
     <w:p>
       <w:pPr>
@@ -2159,10 +1805,10 @@
           <w:noProof/>
         </w:rPr>
         <w:drawing>
-          <wp:inline distT="0" distB="0" distL="0" distR="0" wp14:anchorId="15FBB4D6" wp14:editId="7D27D3E6">
-            <wp:extent cx="5731510" cy="945515"/>
-            <wp:effectExtent l="0" t="0" r="2540" b="6985"/>
-            <wp:docPr id="548836266" name="Imagen 1"/>
+          <wp:inline distT="0" distB="0" distL="0" distR="0" wp14:anchorId="10B71BCC" wp14:editId="014FE38D">
+            <wp:extent cx="5731510" cy="433705"/>
+            <wp:effectExtent l="0" t="0" r="0" b="0"/>
+            <wp:docPr id="1006678251" name="Imagen 3"/>
             <wp:cNvGraphicFramePr>
               <a:graphicFrameLocks xmlns:a="http://schemas.openxmlformats.org/drawingml/2006/main" noChangeAspect="1"/>
             </wp:cNvGraphicFramePr>
@@ -2170,11 +1816,11 @@
               <a:graphicData uri="http://schemas.openxmlformats.org/drawingml/2006/picture">
                 <pic:pic xmlns:pic="http://schemas.openxmlformats.org/drawingml/2006/picture">
                   <pic:nvPicPr>
-                    <pic:cNvPr id="548836266" name="Imagen 548836266"/>
+                    <pic:cNvPr id="1006678251" name="Imagen 1006678251"/>
                     <pic:cNvPicPr/>
                   </pic:nvPicPr>
                   <pic:blipFill>
-                    <a:blip r:embed="rId7" cstate="print">
+                    <a:blip r:embed="rId9" cstate="print">
                       <a:extLst>
                         <a:ext uri="{28A0092B-C50C-407E-A947-70E740481C1C}">
                           <a14:useLocalDpi xmlns:a14="http://schemas.microsoft.com/office/drawing/2010/main" val="0"/>
@@ -2188,7 +1834,7 @@
                   <pic:spPr>
                     <a:xfrm>
                       <a:off x="0" y="0"/>
-                      <a:ext cx="5731510" cy="945515"/>
+                      <a:ext cx="5731510" cy="433705"/>
                     </a:xfrm>
                     <a:prstGeom prst="rect">
                       <a:avLst/>
@@ -2237,7 +1883,6 @@
           <w:bCs/>
           <w:color w:val="000000"/>
         </w:rPr>
-        <w:lastRenderedPageBreak/>
         <w:t>Tabla 2</w:t>
       </w:r>
     </w:p>
@@ -2370,11 +2015,9 @@
             </w:tcMar>
           </w:tcPr>
           <w:p>
-            <w:proofErr w:type="spellStart"/>
             <w:r>
               <w:t>id_p</w:t>
             </w:r>
-            <w:proofErr w:type="spellEnd"/>
           </w:p>
         </w:tc>
         <w:tc>
@@ -2420,7 +2063,6 @@
             </w:tcMar>
           </w:tcPr>
           <w:p>
-            <w:proofErr w:type="spellStart"/>
             <w:r>
               <w:rPr>
                 <w:color w:val="000000"/>
@@ -2429,7 +2071,6 @@
               </w:rPr>
               <w:t>palabra_p</w:t>
             </w:r>
-            <w:proofErr w:type="spellEnd"/>
           </w:p>
         </w:tc>
         <w:tc>
@@ -2475,7 +2116,6 @@
             </w:tcMar>
           </w:tcPr>
           <w:p>
-            <w:proofErr w:type="spellStart"/>
             <w:r>
               <w:rPr>
                 <w:color w:val="000000"/>
@@ -2484,7 +2124,6 @@
               </w:rPr>
               <w:t>color_tinta_p</w:t>
             </w:r>
-            <w:proofErr w:type="spellEnd"/>
           </w:p>
         </w:tc>
         <w:tc>
@@ -2506,31 +2145,7 @@
           </w:tcPr>
           <w:p>
             <w:r>
-              <w:t xml:space="preserve">Color de la tinta en inglés para </w:t>
-            </w:r>
-            <w:proofErr w:type="spellStart"/>
-            <w:r>
-              <w:t>PsychoPy</w:t>
-            </w:r>
-            <w:proofErr w:type="spellEnd"/>
-            <w:r>
-              <w:t xml:space="preserve"> (red, </w:t>
-            </w:r>
-            <w:proofErr w:type="spellStart"/>
-            <w:r>
-              <w:t>green</w:t>
-            </w:r>
-            <w:proofErr w:type="spellEnd"/>
-            <w:r>
-              <w:t xml:space="preserve">, </w:t>
-            </w:r>
-            <w:proofErr w:type="spellStart"/>
-            <w:r>
-              <w:t>yellow</w:t>
-            </w:r>
-            <w:proofErr w:type="spellEnd"/>
-            <w:r>
-              <w:t>, blue)</w:t>
+              <w:t>Color de la tinta en inglés para PsychoPy (red, green, yellow, blue)</w:t>
             </w:r>
           </w:p>
         </w:tc>
@@ -2554,7 +2169,6 @@
             </w:tcMar>
           </w:tcPr>
           <w:p>
-            <w:proofErr w:type="spellStart"/>
             <w:r>
               <w:rPr>
                 <w:color w:val="000000"/>
@@ -2563,7 +2177,6 @@
               </w:rPr>
               <w:t>condición_p</w:t>
             </w:r>
-            <w:proofErr w:type="spellEnd"/>
           </w:p>
         </w:tc>
         <w:tc>
@@ -2609,7 +2222,6 @@
             </w:tcMar>
           </w:tcPr>
           <w:p>
-            <w:proofErr w:type="spellStart"/>
             <w:r>
               <w:rPr>
                 <w:color w:val="000000"/>
@@ -2618,7 +2230,6 @@
               </w:rPr>
               <w:t>tecla_correcta_p</w:t>
             </w:r>
-            <w:proofErr w:type="spellEnd"/>
           </w:p>
         </w:tc>
         <w:tc>
@@ -2667,97 +2278,7 @@
           <w:sz w:val="20"/>
           <w:szCs w:val="20"/>
         </w:rPr>
-        <w:t xml:space="preserve">El componente Text en </w:t>
-      </w:r>
-      <w:proofErr w:type="spellStart"/>
-      <w:r>
-        <w:rPr>
-          <w:color w:val="000000"/>
-          <w:sz w:val="20"/>
-          <w:szCs w:val="20"/>
-        </w:rPr>
-        <w:t>PsychoPy</w:t>
-      </w:r>
-      <w:proofErr w:type="spellEnd"/>
-      <w:r>
-        <w:rPr>
-          <w:color w:val="000000"/>
-          <w:sz w:val="20"/>
-          <w:szCs w:val="20"/>
-        </w:rPr>
-        <w:t xml:space="preserve"> debe tener: Text = $</w:t>
-      </w:r>
-      <w:proofErr w:type="spellStart"/>
-      <w:r>
-        <w:rPr>
-          <w:color w:val="000000"/>
-          <w:sz w:val="20"/>
-          <w:szCs w:val="20"/>
-        </w:rPr>
-        <w:t>palabra_p</w:t>
-      </w:r>
-      <w:proofErr w:type="spellEnd"/>
-      <w:r>
-        <w:rPr>
-          <w:color w:val="000000"/>
-          <w:sz w:val="20"/>
-          <w:szCs w:val="20"/>
-        </w:rPr>
-        <w:t xml:space="preserve"> | Color = $</w:t>
-      </w:r>
-      <w:proofErr w:type="spellStart"/>
-      <w:r>
-        <w:rPr>
-          <w:color w:val="000000"/>
-          <w:sz w:val="20"/>
-          <w:szCs w:val="20"/>
-        </w:rPr>
-        <w:t>color_tinta_p</w:t>
-      </w:r>
-      <w:proofErr w:type="spellEnd"/>
-      <w:r>
-        <w:rPr>
-          <w:color w:val="000000"/>
-          <w:sz w:val="20"/>
-          <w:szCs w:val="20"/>
-        </w:rPr>
-        <w:t xml:space="preserve"> | Set </w:t>
-      </w:r>
-      <w:proofErr w:type="spellStart"/>
-      <w:r>
-        <w:rPr>
-          <w:color w:val="000000"/>
-          <w:sz w:val="20"/>
-          <w:szCs w:val="20"/>
-        </w:rPr>
-        <w:t>every</w:t>
-      </w:r>
-      <w:proofErr w:type="spellEnd"/>
-      <w:r>
-        <w:rPr>
-          <w:color w:val="000000"/>
-          <w:sz w:val="20"/>
-          <w:szCs w:val="20"/>
-        </w:rPr>
-        <w:t xml:space="preserve"> </w:t>
-      </w:r>
-      <w:proofErr w:type="spellStart"/>
-      <w:r>
-        <w:rPr>
-          <w:color w:val="000000"/>
-          <w:sz w:val="20"/>
-          <w:szCs w:val="20"/>
-        </w:rPr>
-        <w:t>repeat</w:t>
-      </w:r>
-      <w:proofErr w:type="spellEnd"/>
-      <w:r>
-        <w:rPr>
-          <w:color w:val="000000"/>
-          <w:sz w:val="20"/>
-          <w:szCs w:val="20"/>
-        </w:rPr>
-        <w:t xml:space="preserve"> activado en ambas propiedades.</w:t>
+        <w:t>El componente Text en PsychoPy debe tener: Text = $palabra_p | Color = $color_tinta_p | Set every repeat activado en ambas propiedades.</w:t>
       </w:r>
     </w:p>
     <w:p>
@@ -2838,6 +2359,7 @@
                 <w:sz w:val="22"/>
                 <w:szCs w:val="22"/>
               </w:rPr>
+              <w:lastRenderedPageBreak/>
               <w:t>Columna</w:t>
             </w:r>
           </w:p>
@@ -3005,7 +2527,6 @@
             </w:tcMar>
           </w:tcPr>
           <w:p>
-            <w:proofErr w:type="spellStart"/>
             <w:r>
               <w:rPr>
                 <w:color w:val="000000"/>
@@ -3014,7 +2535,6 @@
               </w:rPr>
               <w:t>color_tinta</w:t>
             </w:r>
-            <w:proofErr w:type="spellEnd"/>
           </w:p>
         </w:tc>
         <w:tc>
@@ -3036,31 +2556,7 @@
           </w:tcPr>
           <w:p>
             <w:r>
-              <w:t xml:space="preserve">Color de la tinta en inglés para </w:t>
-            </w:r>
-            <w:proofErr w:type="spellStart"/>
-            <w:r>
-              <w:t>PsychoPy</w:t>
-            </w:r>
-            <w:proofErr w:type="spellEnd"/>
-            <w:r>
-              <w:t xml:space="preserve"> (red, </w:t>
-            </w:r>
-            <w:proofErr w:type="spellStart"/>
-            <w:r>
-              <w:t>green</w:t>
-            </w:r>
-            <w:proofErr w:type="spellEnd"/>
-            <w:r>
-              <w:t xml:space="preserve">, </w:t>
-            </w:r>
-            <w:proofErr w:type="spellStart"/>
-            <w:r>
-              <w:t>yellow</w:t>
-            </w:r>
-            <w:proofErr w:type="spellEnd"/>
-            <w:r>
-              <w:t>, blue)</w:t>
+              <w:t>Color de la tinta en inglés para PsychoPy (red, green, yellow, blue)</w:t>
             </w:r>
           </w:p>
         </w:tc>
@@ -3084,7 +2580,6 @@
             </w:tcMar>
           </w:tcPr>
           <w:p>
-            <w:proofErr w:type="spellStart"/>
             <w:r>
               <w:rPr>
                 <w:color w:val="000000"/>
@@ -3093,7 +2588,6 @@
               </w:rPr>
               <w:t>condicion</w:t>
             </w:r>
-            <w:proofErr w:type="spellEnd"/>
           </w:p>
         </w:tc>
         <w:tc>
@@ -3139,7 +2633,6 @@
             </w:tcMar>
           </w:tcPr>
           <w:p>
-            <w:proofErr w:type="spellStart"/>
             <w:r>
               <w:rPr>
                 <w:color w:val="000000"/>
@@ -3148,7 +2641,6 @@
               </w:rPr>
               <w:t>tecla_correcta</w:t>
             </w:r>
-            <w:proofErr w:type="spellEnd"/>
           </w:p>
         </w:tc>
         <w:tc>
@@ -3197,115 +2689,7 @@
           <w:sz w:val="20"/>
           <w:szCs w:val="20"/>
         </w:rPr>
-        <w:t xml:space="preserve">El componente Text en </w:t>
-      </w:r>
-      <w:proofErr w:type="spellStart"/>
-      <w:r>
-        <w:rPr>
-          <w:color w:val="000000"/>
-          <w:sz w:val="20"/>
-          <w:szCs w:val="20"/>
-        </w:rPr>
-        <w:t>PsychoPy</w:t>
-      </w:r>
-      <w:proofErr w:type="spellEnd"/>
-      <w:r>
-        <w:rPr>
-          <w:color w:val="000000"/>
-          <w:sz w:val="20"/>
-          <w:szCs w:val="20"/>
-        </w:rPr>
-        <w:t xml:space="preserve"> debe tener: Text = $</w:t>
-      </w:r>
-      <w:proofErr w:type="gramStart"/>
-      <w:r>
-        <w:rPr>
-          <w:color w:val="000000"/>
-          <w:sz w:val="20"/>
-          <w:szCs w:val="20"/>
-        </w:rPr>
-        <w:t>palabra  |</w:t>
-      </w:r>
-      <w:proofErr w:type="gramEnd"/>
-      <w:r>
-        <w:rPr>
-          <w:color w:val="000000"/>
-          <w:sz w:val="20"/>
-          <w:szCs w:val="20"/>
-        </w:rPr>
-        <w:t xml:space="preserve">  Color = $</w:t>
-      </w:r>
-      <w:proofErr w:type="spellStart"/>
-      <w:r>
-        <w:rPr>
-          <w:color w:val="000000"/>
-          <w:sz w:val="20"/>
-          <w:szCs w:val="20"/>
-        </w:rPr>
-        <w:t>color_</w:t>
-      </w:r>
-      <w:proofErr w:type="gramStart"/>
-      <w:r>
-        <w:rPr>
-          <w:color w:val="000000"/>
-          <w:sz w:val="20"/>
-          <w:szCs w:val="20"/>
-        </w:rPr>
-        <w:t>tinta</w:t>
-      </w:r>
-      <w:proofErr w:type="spellEnd"/>
-      <w:r>
-        <w:rPr>
-          <w:color w:val="000000"/>
-          <w:sz w:val="20"/>
-          <w:szCs w:val="20"/>
-        </w:rPr>
-        <w:t xml:space="preserve">  |</w:t>
-      </w:r>
-      <w:proofErr w:type="gramEnd"/>
-      <w:r>
-        <w:rPr>
-          <w:color w:val="000000"/>
-          <w:sz w:val="20"/>
-          <w:szCs w:val="20"/>
-        </w:rPr>
-        <w:t xml:space="preserve">  Set </w:t>
-      </w:r>
-      <w:proofErr w:type="spellStart"/>
-      <w:r>
-        <w:rPr>
-          <w:color w:val="000000"/>
-          <w:sz w:val="20"/>
-          <w:szCs w:val="20"/>
-        </w:rPr>
-        <w:t>every</w:t>
-      </w:r>
-      <w:proofErr w:type="spellEnd"/>
-      <w:r>
-        <w:rPr>
-          <w:color w:val="000000"/>
-          <w:sz w:val="20"/>
-          <w:szCs w:val="20"/>
-        </w:rPr>
-        <w:t xml:space="preserve"> </w:t>
-      </w:r>
-      <w:proofErr w:type="spellStart"/>
-      <w:r>
-        <w:rPr>
-          <w:color w:val="000000"/>
-          <w:sz w:val="20"/>
-          <w:szCs w:val="20"/>
-        </w:rPr>
-        <w:t>repeat</w:t>
-      </w:r>
-      <w:proofErr w:type="spellEnd"/>
-      <w:r>
-        <w:rPr>
-          <w:color w:val="000000"/>
-          <w:sz w:val="20"/>
-          <w:szCs w:val="20"/>
-        </w:rPr>
-        <w:t xml:space="preserve"> activado en ambas propiedades.</w:t>
+        <w:t>El componente Text en PsychoPy debe tener: Text = $palabra  |  Color = $color_tinta  |  Set every repeat activado en ambas propiedades.</w:t>
       </w:r>
     </w:p>
     <w:p>
@@ -3351,7 +2735,19 @@
           <w:color w:val="000000"/>
         </w:rPr>
         <w:tab/>
-        <w:t>instrucciones_stroop.docx — texto de cada pantalla con notas técnicas, en formato académico</w:t>
+        <w:t xml:space="preserve">instrucciones_stroop.docx </w:t>
+      </w:r>
+      <w:r>
+        <w:rPr>
+          <w:color w:val="000000"/>
+        </w:rPr>
+        <w:t>-</w:t>
+      </w:r>
+      <w:r>
+        <w:rPr>
+          <w:color w:val="000000"/>
+        </w:rPr>
+        <w:t xml:space="preserve"> texto de cada pantalla con notas técnicas, en formato académico</w:t>
       </w:r>
     </w:p>
     <w:p>
@@ -3371,44 +2767,20 @@
           <w:color w:val="000000"/>
         </w:rPr>
         <w:tab/>
-        <w:t>media/</w:t>
-      </w:r>
-      <w:proofErr w:type="spellStart"/>
-      <w:r>
-        <w:rPr>
-          <w:color w:val="000000"/>
-        </w:rPr>
-        <w:t>instructions</w:t>
-      </w:r>
-      <w:proofErr w:type="spellEnd"/>
-      <w:r>
-        <w:rPr>
-          <w:color w:val="000000"/>
-        </w:rPr>
-        <w:t xml:space="preserve">/*.png — imágenes con fondo negro y colores para usar directamente en </w:t>
-      </w:r>
-      <w:proofErr w:type="spellStart"/>
-      <w:r>
-        <w:rPr>
-          <w:color w:val="000000"/>
-        </w:rPr>
-        <w:t>PsychoPy</w:t>
-      </w:r>
-      <w:proofErr w:type="spellEnd"/>
-      <w:r>
-        <w:rPr>
-          <w:color w:val="000000"/>
-        </w:rPr>
-        <w:t xml:space="preserve"> como componente </w:t>
-      </w:r>
-      <w:proofErr w:type="spellStart"/>
-      <w:r>
-        <w:rPr>
-          <w:color w:val="000000"/>
-        </w:rPr>
-        <w:t>Image</w:t>
-      </w:r>
-      <w:proofErr w:type="spellEnd"/>
+        <w:t xml:space="preserve">media/instructions/*.png </w:t>
+      </w:r>
+      <w:r>
+        <w:rPr>
+          <w:color w:val="000000"/>
+        </w:rPr>
+        <w:t>-</w:t>
+      </w:r>
+      <w:r>
+        <w:rPr>
+          <w:color w:val="000000"/>
+        </w:rPr>
+        <w:t xml:space="preserve"> imágenes con fondo negro y colores para usar directamente en PsychoPy como componente Image</w:t>
+      </w:r>
     </w:p>
     <w:p>
       <w:pPr>
@@ -3475,61 +2847,7 @@
                 <w:sz w:val="22"/>
                 <w:szCs w:val="22"/>
               </w:rPr>
-              <w:t xml:space="preserve">Las imágenes .png se usan como componente </w:t>
-            </w:r>
-            <w:proofErr w:type="spellStart"/>
-            <w:r>
-              <w:rPr>
-                <w:color w:val="000000"/>
-                <w:sz w:val="22"/>
-                <w:szCs w:val="22"/>
-              </w:rPr>
-              <w:t>Image</w:t>
-            </w:r>
-            <w:proofErr w:type="spellEnd"/>
-            <w:r>
-              <w:rPr>
-                <w:color w:val="000000"/>
-                <w:sz w:val="22"/>
-                <w:szCs w:val="22"/>
-              </w:rPr>
-              <w:t xml:space="preserve"> en </w:t>
-            </w:r>
-            <w:proofErr w:type="spellStart"/>
-            <w:r>
-              <w:rPr>
-                <w:color w:val="000000"/>
-                <w:sz w:val="22"/>
-                <w:szCs w:val="22"/>
-              </w:rPr>
-              <w:t>PsychoPy</w:t>
-            </w:r>
-            <w:proofErr w:type="spellEnd"/>
-            <w:r>
-              <w:rPr>
-                <w:color w:val="000000"/>
-                <w:sz w:val="22"/>
-                <w:szCs w:val="22"/>
-              </w:rPr>
-              <w:t xml:space="preserve"> (no como componente Text) para mostrar las instrucciones con color. Cada imagen corresponde a una </w:t>
-            </w:r>
-            <w:proofErr w:type="spellStart"/>
-            <w:r>
-              <w:rPr>
-                <w:color w:val="000000"/>
-                <w:sz w:val="22"/>
-                <w:szCs w:val="22"/>
-              </w:rPr>
-              <w:t>routine</w:t>
-            </w:r>
-            <w:proofErr w:type="spellEnd"/>
-            <w:r>
-              <w:rPr>
-                <w:color w:val="000000"/>
-                <w:sz w:val="22"/>
-                <w:szCs w:val="22"/>
-              </w:rPr>
-              <w:t xml:space="preserve"> del flujo.</w:t>
+              <w:t>Las imágenes .png se usan como componente Image en PsychoPy (no como componente Text) para mostrar las instrucciones con color. Cada imagen corresponde a una routine del flujo.</w:t>
             </w:r>
           </w:p>
         </w:tc>
@@ -3545,7 +2863,6 @@
           <w:bCs/>
           <w:color w:val="000000"/>
         </w:rPr>
-        <w:lastRenderedPageBreak/>
         <w:t>7. Análisis de resultados</w:t>
       </w:r>
     </w:p>
@@ -3558,21 +2875,7 @@
         <w:rPr>
           <w:color w:val="000000"/>
         </w:rPr>
-        <w:t xml:space="preserve">Una vez completada la tarea, el CSV generado por </w:t>
-      </w:r>
-      <w:proofErr w:type="spellStart"/>
-      <w:r>
-        <w:rPr>
-          <w:color w:val="000000"/>
-        </w:rPr>
-        <w:t>PsychoPy</w:t>
-      </w:r>
-      <w:proofErr w:type="spellEnd"/>
-      <w:r>
-        <w:rPr>
-          <w:color w:val="000000"/>
-        </w:rPr>
-        <w:t xml:space="preserve"> puede procesarse en la aplicación web del curso, sin necesidad de instalar ningún software adicional:</w:t>
+        <w:t>Una vez completada la tarea, el CSV generado por PsychoPy puede procesarse en la aplicación web del curso, sin necesidad de instalar ningún software adicional:</w:t>
       </w:r>
     </w:p>
     <w:p>
@@ -3599,7 +2902,7 @@
         </w:rPr>
         <w:t xml:space="preserve">Enlace: </w:t>
       </w:r>
-      <w:hyperlink r:id="rId8" w:history="1">
+      <w:hyperlink r:id="rId10" w:history="1">
         <w:r>
           <w:rPr>
             <w:color w:val="1A6B9E"/>
@@ -3659,21 +2962,7 @@
           <w:color w:val="000000"/>
         </w:rPr>
         <w:tab/>
-        <w:t>Arrastrar el archivo .</w:t>
-      </w:r>
-      <w:proofErr w:type="spellStart"/>
-      <w:r>
-        <w:rPr>
-          <w:color w:val="000000"/>
-        </w:rPr>
-        <w:t>csv</w:t>
-      </w:r>
-      <w:proofErr w:type="spellEnd"/>
-      <w:r>
-        <w:rPr>
-          <w:color w:val="000000"/>
-        </w:rPr>
-        <w:t xml:space="preserve"> al área de carga.</w:t>
+        <w:t>Arrastrar el archivo .csv al área de carga.</w:t>
       </w:r>
     </w:p>
     <w:p>
@@ -3701,6 +2990,9 @@
         <w:spacing w:before="40" w:after="40" w:line="276" w:lineRule="auto"/>
         <w:ind w:left="720" w:hanging="360"/>
         <w:jc w:val="both"/>
+        <w:rPr>
+          <w:color w:val="000000"/>
+        </w:rPr>
       </w:pPr>
       <w:r>
         <w:rPr>
@@ -3718,7 +3010,8 @@
     </w:p>
     <w:p>
       <w:pPr>
-        <w:spacing w:before="80"/>
+        <w:spacing w:before="40" w:after="40" w:line="276" w:lineRule="auto"/>
+        <w:jc w:val="both"/>
       </w:pPr>
     </w:p>
     <w:tbl>
@@ -3780,25 +3073,7 @@
                 <w:sz w:val="22"/>
                 <w:szCs w:val="22"/>
               </w:rPr>
-              <w:t xml:space="preserve">La aplicación procesa únicamente los </w:t>
-            </w:r>
-            <w:proofErr w:type="spellStart"/>
-            <w:r>
-              <w:rPr>
-                <w:color w:val="000000"/>
-                <w:sz w:val="22"/>
-                <w:szCs w:val="22"/>
-              </w:rPr>
-              <w:t>trials</w:t>
-            </w:r>
-            <w:proofErr w:type="spellEnd"/>
-            <w:r>
-              <w:rPr>
-                <w:color w:val="000000"/>
-                <w:sz w:val="22"/>
-                <w:szCs w:val="22"/>
-              </w:rPr>
-              <w:t xml:space="preserve"> de la fase experimental. La fase de práctica no se incluye en el análisis.</w:t>
+              <w:t>La aplicación procesa únicamente los trials de la fase experimental. La fase de práctica no se incluye en el análisis.</w:t>
             </w:r>
           </w:p>
         </w:tc>
@@ -3819,6 +3094,7 @@
           <w:color w:val="000000"/>
           <w:lang w:val="en-US"/>
         </w:rPr>
+        <w:lastRenderedPageBreak/>
         <w:t>Referencias</w:t>
       </w:r>
       <w:proofErr w:type="spellEnd"/>
@@ -3836,23 +3112,7 @@
           <w:color w:val="000000"/>
           <w:lang w:val="en-US"/>
         </w:rPr>
-        <w:t xml:space="preserve">MacLeod, C. M. (1991). Half a century of research on the Stroop </w:t>
-      </w:r>
-      <w:proofErr w:type="gramStart"/>
-      <w:r>
-        <w:rPr>
-          <w:color w:val="000000"/>
-          <w:lang w:val="en-US"/>
-        </w:rPr>
-        <w:t>effect</w:t>
-      </w:r>
-      <w:proofErr w:type="gramEnd"/>
-      <w:r>
-        <w:rPr>
-          <w:color w:val="000000"/>
-          <w:lang w:val="en-US"/>
-        </w:rPr>
-        <w:t xml:space="preserve">: An integrative review. </w:t>
+        <w:t xml:space="preserve">MacLeod, C. M. (1991). Half a century of research on the Stroop effect: An integrative review. </w:t>
       </w:r>
       <w:r>
         <w:rPr>
@@ -3935,56 +3195,8 @@
         <w:t xml:space="preserve"> https://doi.org/10.3758/s13428-018-01193-y</w:t>
       </w:r>
     </w:p>
-    <w:p>
-      <w:pPr>
-        <w:spacing w:before="360" w:after="120" w:line="276" w:lineRule="auto"/>
-      </w:pPr>
-      <w:r>
-        <w:rPr>
-          <w:b/>
-          <w:bCs/>
-          <w:color w:val="000000"/>
-        </w:rPr>
-        <w:t>Contacto</w:t>
-      </w:r>
-    </w:p>
-    <w:p>
-      <w:pPr>
-        <w:spacing w:after="120" w:line="276" w:lineRule="auto"/>
-      </w:pPr>
-      <w:r>
-        <w:rPr>
-          <w:b/>
-          <w:bCs/>
-          <w:color w:val="000000"/>
-        </w:rPr>
-        <w:t>Marcelo Landa</w:t>
-      </w:r>
-    </w:p>
-    <w:p>
-      <w:pPr>
-        <w:spacing w:after="120" w:line="276" w:lineRule="auto"/>
-      </w:pPr>
-      <w:r>
-        <w:rPr>
-          <w:color w:val="000000"/>
-        </w:rPr>
-        <w:t>Asistente de cátedra — Investigación e Intervención desde las Neurociencias Aplicadas</w:t>
-      </w:r>
-    </w:p>
-    <w:p>
-      <w:pPr>
-        <w:spacing w:after="120" w:line="276" w:lineRule="auto"/>
-      </w:pPr>
-      <w:r>
-        <w:rPr>
-          <w:color w:val="000000"/>
-        </w:rPr>
-        <w:t>Universidad de Lima</w:t>
-      </w:r>
-    </w:p>
     <w:sectPr>
-      <w:footerReference w:type="default" r:id="rId9"/>
+      <w:footerReference w:type="default" r:id="rId11"/>
       <w:pgSz w:w="11906" w:h="16838"/>
       <w:pgMar w:top="1440" w:right="1440" w:bottom="1440" w:left="1440" w:header="708" w:footer="708" w:gutter="0"/>
       <w:cols w:space="720"/>
@@ -3995,7 +3207,7 @@
 </file>
 
 <file path=word/endnotes.xml><?xml version="1.0" encoding="utf-8"?>
-<w:endnotes xmlns:wpc="http://schemas.microsoft.com/office/word/2010/wordprocessingCanvas" xmlns:cx="http://schemas.microsoft.com/office/drawing/2014/chartex" xmlns:cx1="http://schemas.microsoft.com/office/drawing/2015/9/8/chartex" xmlns:cx2="http://schemas.microsoft.com/office/drawing/2015/10/21/chartex" xmlns:cx3="http://schemas.microsoft.com/office/drawing/2016/5/9/chartex" xmlns:cx4="http://schemas.microsoft.com/office/drawing/2016/5/10/chartex" xmlns:cx5="http://schemas.microsoft.com/office/drawing/2016/5/11/chartex" xmlns:cx6="http://schemas.microsoft.com/office/drawing/2016/5/12/chartex" xmlns:cx7="http://schemas.microsoft.com/office/drawing/2016/5/13/chartex" xmlns:cx8="http://schemas.microsoft.com/office/drawing/2016/5/14/chartex" xmlns:mc="http://schemas.openxmlformats.org/markup-compatibility/2006" xmlns:aink="http://schemas.microsoft.com/office/drawing/2016/ink" xmlns:am3d="http://schemas.microsoft.com/office/drawing/2017/model3d" xmlns:o="urn:schemas-microsoft-com:office:office" xmlns:oel="http://schemas.microsoft.com/office/2019/extlst" xmlns:r="http://schemas.openxmlformats.org/officeDocument/2006/relationships" xmlns:m="http://schemas.openxmlformats.org/officeDocument/2006/math" xmlns:v="urn:schemas-microsoft-com:vml" xmlns:wp14="http://schemas.microsoft.com/office/word/2010/wordprocessingDrawing" xmlns:wp="http://schemas.openxmlformats.org/drawingml/2006/wordprocessingDrawing" xmlns:w10="urn:schemas-microsoft-com:office:word" xmlns:w="http://schemas.openxmlformats.org/wordprocessingml/2006/main" xmlns:w14="http://schemas.microsoft.com/office/word/2010/wordml" xmlns:w15="http://schemas.microsoft.com/office/word/2012/wordml" xmlns:w16cex="http://schemas.microsoft.com/office/word/2018/wordml/cex" xmlns:w16cid="http://schemas.microsoft.com/office/word/2016/wordml/cid" xmlns:w16="http://schemas.microsoft.com/office/word/2018/wordml" xmlns:w16du="http://schemas.microsoft.com/office/word/2023/wordml/word16du" xmlns:w16sdtdh="http://schemas.microsoft.com/office/word/2020/wordml/sdtdatahash" xmlns:w16sdtfl="http://schemas.microsoft.com/office/word/2024/wordml/sdtformatlock" xmlns:w16se="http://schemas.microsoft.com/office/word/2015/wordml/symex" xmlns:wpg="http://schemas.microsoft.com/office/word/2010/wordprocessingGroup" xmlns:wpi="http://schemas.microsoft.com/office/word/2010/wordprocessingInk" xmlns:wne="http://schemas.microsoft.com/office/word/2006/wordml" xmlns:wps="http://schemas.microsoft.com/office/word/2010/wordprocessingShape" mc:Ignorable="w14 w15 w16se w16cid w16 w16cex w16sdtdh w16sdtfl w16du wp14">
+<w:endnotes xmlns:wpc="http://schemas.microsoft.com/office/word/2010/wordprocessingCanvas" xmlns:cx="http://schemas.microsoft.com/office/drawing/2014/chartex" xmlns:cx1="http://schemas.microsoft.com/office/drawing/2015/9/8/chartex" xmlns:cx2="http://schemas.microsoft.com/office/drawing/2015/10/21/chartex" xmlns:cx3="http://schemas.microsoft.com/office/drawing/2016/5/9/chartex" xmlns:cx4="http://schemas.microsoft.com/office/drawing/2016/5/10/chartex" xmlns:cx5="http://schemas.microsoft.com/office/drawing/2016/5/11/chartex" xmlns:cx6="http://schemas.microsoft.com/office/drawing/2016/5/12/chartex" xmlns:cx7="http://schemas.microsoft.com/office/drawing/2016/5/13/chartex" xmlns:cx8="http://schemas.microsoft.com/office/drawing/2016/5/14/chartex" xmlns:mc="http://schemas.openxmlformats.org/markup-compatibility/2006" xmlns:m="http://schemas.openxmlformats.org/officeDocument/2006/math" xmlns:aink="http://schemas.microsoft.com/office/drawing/2016/ink" xmlns:am3d="http://schemas.microsoft.com/office/drawing/2017/model3d" xmlns:oel="http://schemas.microsoft.com/office/2019/extlst" xmlns:r="http://schemas.openxmlformats.org/officeDocument/2006/relationships" xmlns:wp14="http://schemas.microsoft.com/office/word/2010/wordprocessingDrawing" xmlns:wp="http://schemas.openxmlformats.org/drawingml/2006/wordprocessingDrawing" xmlns:wpg="http://schemas.microsoft.com/office/word/2010/wordprocessingGroup" xmlns:wpi="http://schemas.microsoft.com/office/word/2010/wordprocessingInk" xmlns:wps="http://schemas.microsoft.com/office/word/2010/wordprocessingShape" xmlns:o="urn:schemas-microsoft-com:office:office" xmlns:v="urn:schemas-microsoft-com:vml" xmlns:w10="urn:schemas-microsoft-com:office:word" xmlns:w="http://schemas.openxmlformats.org/wordprocessingml/2006/main" xmlns:w14="http://schemas.microsoft.com/office/word/2010/wordml" xmlns:w15="http://schemas.microsoft.com/office/word/2012/wordml" xmlns:w16cex="http://schemas.microsoft.com/office/word/2018/wordml/cex" xmlns:w16cid="http://schemas.microsoft.com/office/word/2016/wordml/cid" xmlns:w16="http://schemas.microsoft.com/office/word/2018/wordml" xmlns:w16sdtdh="http://schemas.microsoft.com/office/word/2020/wordml/sdtdatahash" xmlns:w16sdtfl="http://schemas.microsoft.com/office/word/2024/wordml/sdtformatlock" xmlns:w16se="http://schemas.microsoft.com/office/word/2015/wordml/symex" xmlns:w16du="http://schemas.microsoft.com/office/word/2023/wordml/word16du" xmlns:wne="http://schemas.microsoft.com/office/word/2006/wordml" mc:Ignorable="w14 w15 w16se w16cid w16 w16cex w16sdtdh w16sdtfl w16du wp14">
   <w:endnote w:type="separator" w:id="-1">
     <w:p>
       <w:r>
@@ -4014,7 +3226,7 @@
 </file>
 
 <file path=word/footer1.xml><?xml version="1.0" encoding="utf-8"?>
-<w:ftr xmlns:wpc="http://schemas.microsoft.com/office/word/2010/wordprocessingCanvas" xmlns:cx="http://schemas.microsoft.com/office/drawing/2014/chartex" xmlns:cx1="http://schemas.microsoft.com/office/drawing/2015/9/8/chartex" xmlns:cx2="http://schemas.microsoft.com/office/drawing/2015/10/21/chartex" xmlns:cx3="http://schemas.microsoft.com/office/drawing/2016/5/9/chartex" xmlns:cx4="http://schemas.microsoft.com/office/drawing/2016/5/10/chartex" xmlns:cx5="http://schemas.microsoft.com/office/drawing/2016/5/11/chartex" xmlns:cx6="http://schemas.microsoft.com/office/drawing/2016/5/12/chartex" xmlns:cx7="http://schemas.microsoft.com/office/drawing/2016/5/13/chartex" xmlns:cx8="http://schemas.microsoft.com/office/drawing/2016/5/14/chartex" xmlns:mc="http://schemas.openxmlformats.org/markup-compatibility/2006" xmlns:aink="http://schemas.microsoft.com/office/drawing/2016/ink" xmlns:am3d="http://schemas.microsoft.com/office/drawing/2017/model3d" xmlns:o="urn:schemas-microsoft-com:office:office" xmlns:oel="http://schemas.microsoft.com/office/2019/extlst" xmlns:r="http://schemas.openxmlformats.org/officeDocument/2006/relationships" xmlns:m="http://schemas.openxmlformats.org/officeDocument/2006/math" xmlns:v="urn:schemas-microsoft-com:vml" xmlns:wp14="http://schemas.microsoft.com/office/word/2010/wordprocessingDrawing" xmlns:wp="http://schemas.openxmlformats.org/drawingml/2006/wordprocessingDrawing" xmlns:w10="urn:schemas-microsoft-com:office:word" xmlns:w="http://schemas.openxmlformats.org/wordprocessingml/2006/main" xmlns:w14="http://schemas.microsoft.com/office/word/2010/wordml" xmlns:w15="http://schemas.microsoft.com/office/word/2012/wordml" xmlns:w16cex="http://schemas.microsoft.com/office/word/2018/wordml/cex" xmlns:w16cid="http://schemas.microsoft.com/office/word/2016/wordml/cid" xmlns:w16="http://schemas.microsoft.com/office/word/2018/wordml" xmlns:w16du="http://schemas.microsoft.com/office/word/2023/wordml/word16du" xmlns:w16sdtdh="http://schemas.microsoft.com/office/word/2020/wordml/sdtdatahash" xmlns:w16sdtfl="http://schemas.microsoft.com/office/word/2024/wordml/sdtformatlock" xmlns:w16se="http://schemas.microsoft.com/office/word/2015/wordml/symex" xmlns:wpg="http://schemas.microsoft.com/office/word/2010/wordprocessingGroup" xmlns:wpi="http://schemas.microsoft.com/office/word/2010/wordprocessingInk" xmlns:wne="http://schemas.microsoft.com/office/word/2006/wordml" xmlns:wps="http://schemas.microsoft.com/office/word/2010/wordprocessingShape" mc:Ignorable="w14 w15 w16se w16cid w16 w16cex w16sdtdh w16sdtfl w16du wp14">
+<w:ftr xmlns:wpc="http://schemas.microsoft.com/office/word/2010/wordprocessingCanvas" xmlns:cx="http://schemas.microsoft.com/office/drawing/2014/chartex" xmlns:cx1="http://schemas.microsoft.com/office/drawing/2015/9/8/chartex" xmlns:cx2="http://schemas.microsoft.com/office/drawing/2015/10/21/chartex" xmlns:cx3="http://schemas.microsoft.com/office/drawing/2016/5/9/chartex" xmlns:cx4="http://schemas.microsoft.com/office/drawing/2016/5/10/chartex" xmlns:cx5="http://schemas.microsoft.com/office/drawing/2016/5/11/chartex" xmlns:cx6="http://schemas.microsoft.com/office/drawing/2016/5/12/chartex" xmlns:cx7="http://schemas.microsoft.com/office/drawing/2016/5/13/chartex" xmlns:cx8="http://schemas.microsoft.com/office/drawing/2016/5/14/chartex" xmlns:mc="http://schemas.openxmlformats.org/markup-compatibility/2006" xmlns:m="http://schemas.openxmlformats.org/officeDocument/2006/math" xmlns:aink="http://schemas.microsoft.com/office/drawing/2016/ink" xmlns:am3d="http://schemas.microsoft.com/office/drawing/2017/model3d" xmlns:oel="http://schemas.microsoft.com/office/2019/extlst" xmlns:r="http://schemas.openxmlformats.org/officeDocument/2006/relationships" xmlns:wp14="http://schemas.microsoft.com/office/word/2010/wordprocessingDrawing" xmlns:wp="http://schemas.openxmlformats.org/drawingml/2006/wordprocessingDrawing" xmlns:wpg="http://schemas.microsoft.com/office/word/2010/wordprocessingGroup" xmlns:wpi="http://schemas.microsoft.com/office/word/2010/wordprocessingInk" xmlns:wps="http://schemas.microsoft.com/office/word/2010/wordprocessingShape" xmlns:o="urn:schemas-microsoft-com:office:office" xmlns:v="urn:schemas-microsoft-com:vml" xmlns:w10="urn:schemas-microsoft-com:office:word" xmlns:w="http://schemas.openxmlformats.org/wordprocessingml/2006/main" xmlns:w14="http://schemas.microsoft.com/office/word/2010/wordml" xmlns:w15="http://schemas.microsoft.com/office/word/2012/wordml" xmlns:w16cex="http://schemas.microsoft.com/office/word/2018/wordml/cex" xmlns:w16cid="http://schemas.microsoft.com/office/word/2016/wordml/cid" xmlns:w16="http://schemas.microsoft.com/office/word/2018/wordml" xmlns:w16sdtdh="http://schemas.microsoft.com/office/word/2020/wordml/sdtdatahash" xmlns:w16sdtfl="http://schemas.microsoft.com/office/word/2024/wordml/sdtformatlock" xmlns:w16se="http://schemas.microsoft.com/office/word/2015/wordml/symex" xmlns:w16du="http://schemas.microsoft.com/office/word/2023/wordml/word16du" xmlns:wne="http://schemas.microsoft.com/office/word/2006/wordml" mc:Ignorable="w14 w15 w16se w16cid w16 w16cex w16sdtdh w16sdtfl w16du wp14">
   <w:p>
     <w:pPr>
       <w:jc w:val="right"/>
@@ -4065,7 +3277,7 @@
 </file>
 
 <file path=word/footnotes.xml><?xml version="1.0" encoding="utf-8"?>
-<w:footnotes xmlns:wpc="http://schemas.microsoft.com/office/word/2010/wordprocessingCanvas" xmlns:cx="http://schemas.microsoft.com/office/drawing/2014/chartex" xmlns:cx1="http://schemas.microsoft.com/office/drawing/2015/9/8/chartex" xmlns:cx2="http://schemas.microsoft.com/office/drawing/2015/10/21/chartex" xmlns:cx3="http://schemas.microsoft.com/office/drawing/2016/5/9/chartex" xmlns:cx4="http://schemas.microsoft.com/office/drawing/2016/5/10/chartex" xmlns:cx5="http://schemas.microsoft.com/office/drawing/2016/5/11/chartex" xmlns:cx6="http://schemas.microsoft.com/office/drawing/2016/5/12/chartex" xmlns:cx7="http://schemas.microsoft.com/office/drawing/2016/5/13/chartex" xmlns:cx8="http://schemas.microsoft.com/office/drawing/2016/5/14/chartex" xmlns:mc="http://schemas.openxmlformats.org/markup-compatibility/2006" xmlns:aink="http://schemas.microsoft.com/office/drawing/2016/ink" xmlns:am3d="http://schemas.microsoft.com/office/drawing/2017/model3d" xmlns:o="urn:schemas-microsoft-com:office:office" xmlns:oel="http://schemas.microsoft.com/office/2019/extlst" xmlns:r="http://schemas.openxmlformats.org/officeDocument/2006/relationships" xmlns:m="http://schemas.openxmlformats.org/officeDocument/2006/math" xmlns:v="urn:schemas-microsoft-com:vml" xmlns:wp14="http://schemas.microsoft.com/office/word/2010/wordprocessingDrawing" xmlns:wp="http://schemas.openxmlformats.org/drawingml/2006/wordprocessingDrawing" xmlns:w10="urn:schemas-microsoft-com:office:word" xmlns:w="http://schemas.openxmlformats.org/wordprocessingml/2006/main" xmlns:w14="http://schemas.microsoft.com/office/word/2010/wordml" xmlns:w15="http://schemas.microsoft.com/office/word/2012/wordml" xmlns:w16cex="http://schemas.microsoft.com/office/word/2018/wordml/cex" xmlns:w16cid="http://schemas.microsoft.com/office/word/2016/wordml/cid" xmlns:w16="http://schemas.microsoft.com/office/word/2018/wordml" xmlns:w16du="http://schemas.microsoft.com/office/word/2023/wordml/word16du" xmlns:w16sdtdh="http://schemas.microsoft.com/office/word/2020/wordml/sdtdatahash" xmlns:w16sdtfl="http://schemas.microsoft.com/office/word/2024/wordml/sdtformatlock" xmlns:w16se="http://schemas.microsoft.com/office/word/2015/wordml/symex" xmlns:wpg="http://schemas.microsoft.com/office/word/2010/wordprocessingGroup" xmlns:wpi="http://schemas.microsoft.com/office/word/2010/wordprocessingInk" xmlns:wne="http://schemas.microsoft.com/office/word/2006/wordml" xmlns:wps="http://schemas.microsoft.com/office/word/2010/wordprocessingShape" mc:Ignorable="w14 w15 w16se w16cid w16 w16cex w16sdtdh w16sdtfl w16du wp14">
+<w:footnotes xmlns:wpc="http://schemas.microsoft.com/office/word/2010/wordprocessingCanvas" xmlns:cx="http://schemas.microsoft.com/office/drawing/2014/chartex" xmlns:cx1="http://schemas.microsoft.com/office/drawing/2015/9/8/chartex" xmlns:cx2="http://schemas.microsoft.com/office/drawing/2015/10/21/chartex" xmlns:cx3="http://schemas.microsoft.com/office/drawing/2016/5/9/chartex" xmlns:cx4="http://schemas.microsoft.com/office/drawing/2016/5/10/chartex" xmlns:cx5="http://schemas.microsoft.com/office/drawing/2016/5/11/chartex" xmlns:cx6="http://schemas.microsoft.com/office/drawing/2016/5/12/chartex" xmlns:cx7="http://schemas.microsoft.com/office/drawing/2016/5/13/chartex" xmlns:cx8="http://schemas.microsoft.com/office/drawing/2016/5/14/chartex" xmlns:mc="http://schemas.openxmlformats.org/markup-compatibility/2006" xmlns:m="http://schemas.openxmlformats.org/officeDocument/2006/math" xmlns:aink="http://schemas.microsoft.com/office/drawing/2016/ink" xmlns:am3d="http://schemas.microsoft.com/office/drawing/2017/model3d" xmlns:oel="http://schemas.microsoft.com/office/2019/extlst" xmlns:r="http://schemas.openxmlformats.org/officeDocument/2006/relationships" xmlns:wp14="http://schemas.microsoft.com/office/word/2010/wordprocessingDrawing" xmlns:wp="http://schemas.openxmlformats.org/drawingml/2006/wordprocessingDrawing" xmlns:wpg="http://schemas.microsoft.com/office/word/2010/wordprocessingGroup" xmlns:wpi="http://schemas.microsoft.com/office/word/2010/wordprocessingInk" xmlns:wps="http://schemas.microsoft.com/office/word/2010/wordprocessingShape" xmlns:o="urn:schemas-microsoft-com:office:office" xmlns:v="urn:schemas-microsoft-com:vml" xmlns:w10="urn:schemas-microsoft-com:office:word" xmlns:w="http://schemas.openxmlformats.org/wordprocessingml/2006/main" xmlns:w14="http://schemas.microsoft.com/office/word/2010/wordml" xmlns:w15="http://schemas.microsoft.com/office/word/2012/wordml" xmlns:w16cex="http://schemas.microsoft.com/office/word/2018/wordml/cex" xmlns:w16cid="http://schemas.microsoft.com/office/word/2016/wordml/cid" xmlns:w16="http://schemas.microsoft.com/office/word/2018/wordml" xmlns:w16sdtdh="http://schemas.microsoft.com/office/word/2020/wordml/sdtdatahash" xmlns:w16sdtfl="http://schemas.microsoft.com/office/word/2024/wordml/sdtformatlock" xmlns:w16se="http://schemas.microsoft.com/office/word/2015/wordml/symex" xmlns:w16du="http://schemas.microsoft.com/office/word/2023/wordml/word16du" xmlns:wne="http://schemas.microsoft.com/office/word/2006/wordml" mc:Ignorable="w14 w15 w16se w16cid w16 w16cex w16sdtdh w16sdtfl w16du wp14">
   <w:footnote w:type="separator" w:id="-1">
     <w:p>
       <w:r>
@@ -4084,7 +3296,7 @@
 </file>
 
 <file path=word/numbering.xml><?xml version="1.0" encoding="utf-8"?>
-<w:numbering xmlns:wpc="http://schemas.microsoft.com/office/word/2010/wordprocessingCanvas" xmlns:cx="http://schemas.microsoft.com/office/drawing/2014/chartex" xmlns:cx1="http://schemas.microsoft.com/office/drawing/2015/9/8/chartex" xmlns:cx2="http://schemas.microsoft.com/office/drawing/2015/10/21/chartex" xmlns:cx3="http://schemas.microsoft.com/office/drawing/2016/5/9/chartex" xmlns:cx4="http://schemas.microsoft.com/office/drawing/2016/5/10/chartex" xmlns:cx5="http://schemas.microsoft.com/office/drawing/2016/5/11/chartex" xmlns:cx6="http://schemas.microsoft.com/office/drawing/2016/5/12/chartex" xmlns:cx7="http://schemas.microsoft.com/office/drawing/2016/5/13/chartex" xmlns:cx8="http://schemas.microsoft.com/office/drawing/2016/5/14/chartex" xmlns:mc="http://schemas.openxmlformats.org/markup-compatibility/2006" xmlns:aink="http://schemas.microsoft.com/office/drawing/2016/ink" xmlns:am3d="http://schemas.microsoft.com/office/drawing/2017/model3d" xmlns:o="urn:schemas-microsoft-com:office:office" xmlns:oel="http://schemas.microsoft.com/office/2019/extlst" xmlns:r="http://schemas.openxmlformats.org/officeDocument/2006/relationships" xmlns:m="http://schemas.openxmlformats.org/officeDocument/2006/math" xmlns:v="urn:schemas-microsoft-com:vml" xmlns:wp14="http://schemas.microsoft.com/office/word/2010/wordprocessingDrawing" xmlns:wp="http://schemas.openxmlformats.org/drawingml/2006/wordprocessingDrawing" xmlns:w10="urn:schemas-microsoft-com:office:word" xmlns:w="http://schemas.openxmlformats.org/wordprocessingml/2006/main" xmlns:w14="http://schemas.microsoft.com/office/word/2010/wordml" xmlns:w15="http://schemas.microsoft.com/office/word/2012/wordml" xmlns:w16cex="http://schemas.microsoft.com/office/word/2018/wordml/cex" xmlns:w16cid="http://schemas.microsoft.com/office/word/2016/wordml/cid" xmlns:w16="http://schemas.microsoft.com/office/word/2018/wordml" xmlns:w16du="http://schemas.microsoft.com/office/word/2023/wordml/word16du" xmlns:w16sdtdh="http://schemas.microsoft.com/office/word/2020/wordml/sdtdatahash" xmlns:w16sdtfl="http://schemas.microsoft.com/office/word/2024/wordml/sdtformatlock" xmlns:w16se="http://schemas.microsoft.com/office/word/2015/wordml/symex" xmlns:wpg="http://schemas.microsoft.com/office/word/2010/wordprocessingGroup" xmlns:wpi="http://schemas.microsoft.com/office/word/2010/wordprocessingInk" xmlns:wne="http://schemas.microsoft.com/office/word/2006/wordml" xmlns:wps="http://schemas.microsoft.com/office/word/2010/wordprocessingShape" mc:Ignorable="w14 w15 w16se w16cid w16 w16cex w16sdtdh w16sdtfl w16du wp14">
+<w:numbering xmlns:wpc="http://schemas.microsoft.com/office/word/2010/wordprocessingCanvas" xmlns:cx="http://schemas.microsoft.com/office/drawing/2014/chartex" xmlns:cx1="http://schemas.microsoft.com/office/drawing/2015/9/8/chartex" xmlns:cx2="http://schemas.microsoft.com/office/drawing/2015/10/21/chartex" xmlns:cx3="http://schemas.microsoft.com/office/drawing/2016/5/9/chartex" xmlns:cx4="http://schemas.microsoft.com/office/drawing/2016/5/10/chartex" xmlns:cx5="http://schemas.microsoft.com/office/drawing/2016/5/11/chartex" xmlns:cx6="http://schemas.microsoft.com/office/drawing/2016/5/12/chartex" xmlns:cx7="http://schemas.microsoft.com/office/drawing/2016/5/13/chartex" xmlns:cx8="http://schemas.microsoft.com/office/drawing/2016/5/14/chartex" xmlns:mc="http://schemas.openxmlformats.org/markup-compatibility/2006" xmlns:m="http://schemas.openxmlformats.org/officeDocument/2006/math" xmlns:aink="http://schemas.microsoft.com/office/drawing/2016/ink" xmlns:am3d="http://schemas.microsoft.com/office/drawing/2017/model3d" xmlns:oel="http://schemas.microsoft.com/office/2019/extlst" xmlns:r="http://schemas.openxmlformats.org/officeDocument/2006/relationships" xmlns:wp14="http://schemas.microsoft.com/office/word/2010/wordprocessingDrawing" xmlns:wp="http://schemas.openxmlformats.org/drawingml/2006/wordprocessingDrawing" xmlns:wpg="http://schemas.microsoft.com/office/word/2010/wordprocessingGroup" xmlns:wpi="http://schemas.microsoft.com/office/word/2010/wordprocessingInk" xmlns:wps="http://schemas.microsoft.com/office/word/2010/wordprocessingShape" xmlns:o="urn:schemas-microsoft-com:office:office" xmlns:v="urn:schemas-microsoft-com:vml" xmlns:w10="urn:schemas-microsoft-com:office:word" xmlns:w="http://schemas.openxmlformats.org/wordprocessingml/2006/main" xmlns:w14="http://schemas.microsoft.com/office/word/2010/wordml" xmlns:w15="http://schemas.microsoft.com/office/word/2012/wordml" xmlns:w16cex="http://schemas.microsoft.com/office/word/2018/wordml/cex" xmlns:w16cid="http://schemas.microsoft.com/office/word/2016/wordml/cid" xmlns:w16="http://schemas.microsoft.com/office/word/2018/wordml" xmlns:w16sdtdh="http://schemas.microsoft.com/office/word/2020/wordml/sdtdatahash" xmlns:w16sdtfl="http://schemas.microsoft.com/office/word/2024/wordml/sdtformatlock" xmlns:w16se="http://schemas.microsoft.com/office/word/2015/wordml/symex" xmlns:w16du="http://schemas.microsoft.com/office/word/2023/wordml/word16du" xmlns:wne="http://schemas.microsoft.com/office/word/2006/wordml" mc:Ignorable="w14 w15 w16se w16cid w16 w16cex w16sdtdh w16sdtfl w16du wp14">
   <w:abstractNum w:abstractNumId="0" w15:restartNumberingAfterBreak="0">
     <w:nsid w:val="5C7F3746"/>
     <w:multiLevelType w:val="hybridMultilevel"/>
@@ -4181,7 +3393,7 @@
 </file>
 
 <file path=word/styles.xml><?xml version="1.0" encoding="utf-8"?>
-<w:styles xmlns:mc="http://schemas.openxmlformats.org/markup-compatibility/2006" xmlns:r="http://schemas.openxmlformats.org/officeDocument/2006/relationships" xmlns:w="http://schemas.openxmlformats.org/wordprocessingml/2006/main" xmlns:w14="http://schemas.microsoft.com/office/word/2010/wordml" xmlns:w15="http://schemas.microsoft.com/office/word/2012/wordml" xmlns:w16cex="http://schemas.microsoft.com/office/word/2018/wordml/cex" xmlns:w16cid="http://schemas.microsoft.com/office/word/2016/wordml/cid" xmlns:w16="http://schemas.microsoft.com/office/word/2018/wordml" xmlns:w16du="http://schemas.microsoft.com/office/word/2023/wordml/word16du" xmlns:w16sdtdh="http://schemas.microsoft.com/office/word/2020/wordml/sdtdatahash" xmlns:w16sdtfl="http://schemas.microsoft.com/office/word/2024/wordml/sdtformatlock" xmlns:w16se="http://schemas.microsoft.com/office/word/2015/wordml/symex" mc:Ignorable="w14 w15 w16se w16cid w16 w16cex w16sdtdh w16sdtfl w16du">
+<w:styles xmlns:mc="http://schemas.openxmlformats.org/markup-compatibility/2006" xmlns:r="http://schemas.openxmlformats.org/officeDocument/2006/relationships" xmlns:w="http://schemas.openxmlformats.org/wordprocessingml/2006/main" xmlns:w14="http://schemas.microsoft.com/office/word/2010/wordml" xmlns:w15="http://schemas.microsoft.com/office/word/2012/wordml" xmlns:w16cex="http://schemas.microsoft.com/office/word/2018/wordml/cex" xmlns:w16cid="http://schemas.microsoft.com/office/word/2016/wordml/cid" xmlns:w16="http://schemas.microsoft.com/office/word/2018/wordml" xmlns:w16sdtdh="http://schemas.microsoft.com/office/word/2020/wordml/sdtdatahash" xmlns:w16sdtfl="http://schemas.microsoft.com/office/word/2024/wordml/sdtformatlock" xmlns:w16se="http://schemas.microsoft.com/office/word/2015/wordml/symex" xmlns:w16du="http://schemas.microsoft.com/office/word/2023/wordml/word16du" mc:Ignorable="w14 w15 w16se w16cid w16 w16cex w16sdtdh w16sdtfl w16du">
   <w:docDefaults>
     <w:rPrDefault>
       <w:rPr>

</xml_diff>